<commit_message>
chore: update phase-06 summary and lab notebook docx
Minor updates to phase execution summary metadata and refreshed
lab notebook Word document.
</commit_message>
<xml_diff>
--- a/notebooks/P10_Lab_Notebook_V3.docx
+++ b/notebooks/P10_Lab_Notebook_V3.docx
@@ -210,28 +210,10 @@
         <w:t xml:space="preserve">Goal: </w:t>
       </w:r>
       <w:r>
-        <w:t>Following project approval,</w:t>
-      </w:r>
-      <w:r>
-        <w:t xml:space="preserve"> I locked in the project direction and wrote out the build plan. </w:t>
-      </w:r>
-      <w:r>
-        <w:t xml:space="preserve">Idea sparked </w:t>
-      </w:r>
-      <w:r>
-        <w:sym w:font="Wingdings" w:char="F0E0"/>
-      </w:r>
-      <w:r>
-        <w:t xml:space="preserve"> my grandmother los</w:t>
-      </w:r>
-      <w:r>
-        <w:t>t</w:t>
-      </w:r>
-      <w:r>
-        <w:t xml:space="preserve"> her ability to recognize family because of dementia was the original motivation, </w:t>
-      </w:r>
-      <w:r>
-        <w:t>and I want to employ my skills of music and neuroscience research somehow.</w:t>
+        <w:t xml:space="preserve">Following project approval, I </w:t>
+      </w:r>
+      <w:r>
+        <w:t>started with my literature review.</w:t>
       </w:r>
     </w:p>
     <w:p>
@@ -239,27 +221,13 @@
         <w:ind w:left="-5" w:right="0"/>
       </w:pPr>
       <w:r>
-        <w:t>N</w:t>
-      </w:r>
-      <w:r>
-        <w:t>euroscience literature gave me a concrete entry point. Iaccarino et al. (2016) showed that 40 Hz γ entrainment reduced amyloid</w:t>
-      </w:r>
-      <w:r>
-        <w:t>-</w:t>
+        <w:t>Iaccarino et al. (2016) showed that 40 Hz γ entrainment reduced amyloid-</w:t>
       </w:r>
       <w:r>
         <w:t>β</w:t>
       </w:r>
       <w:r>
-        <w:t xml:space="preserve"> cluster </w:t>
-      </w:r>
-      <w:proofErr w:type="spellStart"/>
-      <w:r>
-        <w:t xml:space="preserve">load </w:t>
-      </w:r>
-      <w:proofErr w:type="spellEnd"/>
-      <w:r>
-        <w:t>in Alzheimer's mouse models by activating microglia, and Martorell et al. (2019) extended that to multi-sensory stimulation reducing tau pathology. Lahijanian et al. (2024) then showed that auditory entrainment enhanced default mode network connectivity in human dementia patients and published a 35-subject EEG dataset on OpenNeuro (ds005048).</w:t>
+        <w:t xml:space="preserve"> cluster load in Alzheimer's mouse models by activating microglia, and Martorell et al. (2019) extended that to multi-sensory stimulation reducing tau pathology. Lahijanian et al. (2024) then showed that auditory entrainment enhanced default mode network connectivity in human dementia patients and published a 35-subject EEG dataset on OpenNeuro (ds005048).</w:t>
       </w:r>
     </w:p>
     <w:p>
@@ -267,19 +235,10 @@
         <w:ind w:left="-5" w:right="0"/>
       </w:pPr>
       <w:r>
-        <w:t xml:space="preserve">The problem I </w:t>
-      </w:r>
-      <w:r>
-        <w:t>keep</w:t>
-      </w:r>
-      <w:r>
-        <w:t xml:space="preserve"> coming back to </w:t>
-      </w:r>
-      <w:r>
-        <w:t>is</w:t>
-      </w:r>
-      <w:r>
-        <w:t xml:space="preserve"> the clinical protocol itself. Current trials use a rigid fixed schedule</w:t>
+        <w:t xml:space="preserve">Current </w:t>
+      </w:r>
+      <w:r>
+        <w:t>trials use a rigid fixed schedule</w:t>
       </w:r>
       <w:r>
         <w:t xml:space="preserve"> (</w:t>
@@ -299,7 +258,10 @@
         <w:ind w:left="-5" w:right="0"/>
       </w:pPr>
       <w:r>
-        <w:t xml:space="preserve">The question I formalized today: can we predict when a patient's brain will lose entrainment and deliver stimulation proactively, before the decline occurs? </w:t>
+        <w:t>Question</w:t>
+      </w:r>
+      <w:r>
+        <w:t xml:space="preserve">: can we predict when a patient's brain will lose entrainment and deliver stimulation proactively, before the decline occurs? </w:t>
       </w:r>
     </w:p>
     <w:p>
@@ -321,28 +283,7 @@
         <w:ind w:left="-5" w:right="0"/>
       </w:pPr>
       <w:r>
-        <w:t>Software stages:</w:t>
-      </w:r>
-      <w:r>
-        <w:t xml:space="preserve"> data loading, preprocessing, PAC computation, model training, controller logic, and validation. </w:t>
-      </w:r>
-      <w:r>
-        <w:t xml:space="preserve">Must use subject </w:t>
-      </w:r>
-      <w:r>
-        <w:t>level splits (no patient can appear in both training and test data), and causal features for any temporal model (</w:t>
-      </w:r>
-      <w:r>
-        <w:t xml:space="preserve">so </w:t>
-      </w:r>
-      <w:r>
-        <w:t>no future information</w:t>
-      </w:r>
-      <w:r>
-        <w:t xml:space="preserve"> is</w:t>
-      </w:r>
-      <w:r>
-        <w:t xml:space="preserve"> leaking into predictions).</w:t>
+        <w:t>Software stages: data loading, preprocessing, PAC computation, model training, controller logic, and validation. Must use subject level splits (no patient can appear in both training and test data), and causal features for any temporal model (so no future information is leaking into predictions).</w:t>
       </w:r>
     </w:p>
     <w:p>
@@ -351,7 +292,10 @@
         <w:ind w:left="-5" w:right="0"/>
       </w:pPr>
       <w:r>
-        <w:t>The dataset specifics from the OpenNeuro page: 35 elderly dementia patients, 19 EEG channels at 250 Hz, alternating stimulus (40 Hz AM auditory) and rest epochs of 20-40 seconds each. I planned to focus on the 7 frontal channels (Fp1, Fp2, F3, F4, F7, F8, Fz) where the 40 Hz response is strongest, and to extract 2-second analysis windows.</w:t>
+        <w:t>Dataset Specifics</w:t>
+      </w:r>
+      <w:r>
+        <w:t xml:space="preserve"> OpenNeuro page: 35 elderly dementia patients, 19 EEG channels at 250 Hz, alternating stimulus (40 Hz AM auditory) and rest epochs of 20-40 seconds each. I planned to focus on the 7 frontal channels (Fp1, Fp2, F3, F4, F7, F8, Fz) where the 40 Hz response is strongest, and to extract 2-second analysis windows.</w:t>
       </w:r>
     </w:p>
     <w:p>
@@ -446,20 +390,85 @@
           <w:rFonts w:ascii="Courier New" w:eastAsia="Courier New" w:hAnsi="Courier New" w:cs="Courier New"/>
           <w:sz w:val="18"/>
         </w:rPr>
-        <w:t>.</w:t>
-      </w:r>
-      <w:proofErr w:type="spellStart"/>
+        <w:t>.fdt</w:t>
+      </w:r>
+      <w:proofErr w:type="gramEnd"/>
+      <w:r>
+        <w:t xml:space="preserve"> binary data files. Standard MNE-Python readers failed completely.</w:t>
+      </w:r>
+    </w:p>
+    <w:p>
+      <w:pPr>
+        <w:spacing w:after="0"/>
+        <w:ind w:left="-5" w:right="0"/>
+      </w:pPr>
+      <w:r>
+        <w:t>I spent hours debugging before realizing the issue was file format incompatibility</w:t>
+      </w:r>
+      <w:r>
+        <w:t xml:space="preserve">. The </w:t>
+      </w:r>
+      <w:r>
+        <w:t xml:space="preserve">solution was to use </w:t>
+      </w:r>
       <w:r>
         <w:rPr>
           <w:rFonts w:ascii="Courier New" w:eastAsia="Courier New" w:hAnsi="Courier New" w:cs="Courier New"/>
           <w:sz w:val="18"/>
         </w:rPr>
-        <w:t>fdt</w:t>
-      </w:r>
-      <w:proofErr w:type="spellEnd"/>
+        <w:t>h5py</w:t>
+      </w:r>
+      <w:r>
+        <w:t xml:space="preserve"> to </w:t>
+      </w:r>
+      <w:proofErr w:type="gramStart"/>
+      <w:r>
+        <w:t xml:space="preserve">read </w:t>
+      </w:r>
+      <w:r>
+        <w:rPr>
+          <w:rFonts w:ascii="Courier New" w:eastAsia="Courier New" w:hAnsi="Courier New" w:cs="Courier New"/>
+          <w:sz w:val="18"/>
+        </w:rPr>
+        <w:t>.set</w:t>
+      </w:r>
       <w:proofErr w:type="gramEnd"/>
       <w:r>
-        <w:t xml:space="preserve"> binary data files. Standard MNE-Python readers failed completely.</w:t>
+        <w:t xml:space="preserve"> metadata (channel count, sample rate, epoch boundaries) and </w:t>
+      </w:r>
+      <w:proofErr w:type="gramStart"/>
+      <w:r>
+        <w:rPr>
+          <w:rFonts w:ascii="Courier New" w:eastAsia="Courier New" w:hAnsi="Courier New" w:cs="Courier New"/>
+          <w:sz w:val="18"/>
+        </w:rPr>
+        <w:t>numpy.fromfile</w:t>
+      </w:r>
+      <w:proofErr w:type="gramEnd"/>
+      <w:r>
+        <w:rPr>
+          <w:rFonts w:ascii="Courier New" w:eastAsia="Courier New" w:hAnsi="Courier New" w:cs="Courier New"/>
+          <w:sz w:val="18"/>
+        </w:rPr>
+        <w:t>()</w:t>
+      </w:r>
+      <w:r>
+        <w:t xml:space="preserve"> to read </w:t>
+      </w:r>
+      <w:proofErr w:type="gramStart"/>
+      <w:r>
+        <w:t xml:space="preserve">the </w:t>
+      </w:r>
+      <w:r>
+        <w:rPr>
+          <w:rFonts w:ascii="Courier New" w:eastAsia="Courier New" w:hAnsi="Courier New" w:cs="Courier New"/>
+          <w:sz w:val="18"/>
+        </w:rPr>
+        <w:t>.fdt</w:t>
+      </w:r>
+      <w:proofErr w:type="gramEnd"/>
+      <w:r>
+        <w:t xml:space="preserve"> binary data. MATLAB stores matrices in column-major (Fortran) order, while Python defaults to row-major:</w:t>
       </w:r>
     </w:p>
     <w:p>
@@ -467,85 +476,6 @@
         <w:spacing w:after="0"/>
         <w:ind w:left="-5" w:right="0"/>
       </w:pPr>
-      <w:r>
-        <w:t>I spent hours debugging before realizing the issue was fundamental file format incompatibility</w:t>
-      </w:r>
-      <w:r>
-        <w:t xml:space="preserve">. The </w:t>
-      </w:r>
-      <w:r>
-        <w:t xml:space="preserve">solution was to use </w:t>
-      </w:r>
-      <w:r>
-        <w:rPr>
-          <w:rFonts w:ascii="Courier New" w:eastAsia="Courier New" w:hAnsi="Courier New" w:cs="Courier New"/>
-          <w:sz w:val="18"/>
-        </w:rPr>
-        <w:t>h5py</w:t>
-      </w:r>
-      <w:r>
-        <w:t xml:space="preserve"> to </w:t>
-      </w:r>
-      <w:proofErr w:type="gramStart"/>
-      <w:r>
-        <w:t xml:space="preserve">read </w:t>
-      </w:r>
-      <w:r>
-        <w:rPr>
-          <w:rFonts w:ascii="Courier New" w:eastAsia="Courier New" w:hAnsi="Courier New" w:cs="Courier New"/>
-          <w:sz w:val="18"/>
-        </w:rPr>
-        <w:t>.set</w:t>
-      </w:r>
-      <w:proofErr w:type="gramEnd"/>
-      <w:r>
-        <w:t xml:space="preserve"> metadata (channel count, sample rate, epoch boundaries) and </w:t>
-      </w:r>
-      <w:proofErr w:type="spellStart"/>
-      <w:proofErr w:type="gramStart"/>
-      <w:r>
-        <w:rPr>
-          <w:rFonts w:ascii="Courier New" w:eastAsia="Courier New" w:hAnsi="Courier New" w:cs="Courier New"/>
-          <w:sz w:val="18"/>
-        </w:rPr>
-        <w:t>numpy.fromfile</w:t>
-      </w:r>
-      <w:proofErr w:type="spellEnd"/>
-      <w:proofErr w:type="gramEnd"/>
-      <w:r>
-        <w:rPr>
-          <w:rFonts w:ascii="Courier New" w:eastAsia="Courier New" w:hAnsi="Courier New" w:cs="Courier New"/>
-          <w:sz w:val="18"/>
-        </w:rPr>
-        <w:t>()</w:t>
-      </w:r>
-      <w:r>
-        <w:t xml:space="preserve"> to read </w:t>
-      </w:r>
-      <w:proofErr w:type="gramStart"/>
-      <w:r>
-        <w:t xml:space="preserve">the </w:t>
-      </w:r>
-      <w:r>
-        <w:rPr>
-          <w:rFonts w:ascii="Courier New" w:eastAsia="Courier New" w:hAnsi="Courier New" w:cs="Courier New"/>
-          <w:sz w:val="18"/>
-        </w:rPr>
-        <w:t>.</w:t>
-      </w:r>
-      <w:proofErr w:type="spellStart"/>
-      <w:r>
-        <w:rPr>
-          <w:rFonts w:ascii="Courier New" w:eastAsia="Courier New" w:hAnsi="Courier New" w:cs="Courier New"/>
-          <w:sz w:val="18"/>
-        </w:rPr>
-        <w:t>fdt</w:t>
-      </w:r>
-      <w:proofErr w:type="spellEnd"/>
-      <w:proofErr w:type="gramEnd"/>
-      <w:r>
-        <w:t xml:space="preserve"> binary data. MATLAB stores matrices in column-major (Fortran) order, while Python defaults to row-major:</w:t>
-      </w:r>
     </w:p>
     <w:tbl>
       <w:tblPr>
@@ -554,8 +484,6 @@
         <w:tblInd w:w="240" w:type="dxa"/>
         <w:tblCellMar>
           <w:top w:w="67" w:type="dxa"/>
-          <w:left w:w="0" w:type="dxa"/>
-          <w:bottom w:w="0" w:type="dxa"/>
           <w:right w:w="115" w:type="dxa"/>
         </w:tblCellMar>
         <w:tblLook w:val="04A0" w:firstRow="1" w:lastRow="0" w:firstColumn="1" w:lastColumn="0" w:noHBand="0" w:noVBand="1"/>
@@ -589,70 +517,75 @@
                 <w:rFonts w:ascii="Courier New" w:eastAsia="Courier New" w:hAnsi="Courier New" w:cs="Courier New"/>
                 <w:sz w:val="18"/>
               </w:rPr>
-              <w:t>with h5py.File(</w:t>
-            </w:r>
-            <w:proofErr w:type="spellStart"/>
+              <w:t>with h5py.File(set_path, 'r') as</w:t>
+            </w:r>
             <w:r>
               <w:rPr>
                 <w:rFonts w:ascii="Courier New" w:eastAsia="Courier New" w:hAnsi="Courier New" w:cs="Courier New"/>
                 <w:sz w:val="18"/>
               </w:rPr>
-              <w:t>set_path</w:t>
-            </w:r>
-            <w:proofErr w:type="spellEnd"/>
+              <w:t xml:space="preserve"> </w:t>
+            </w:r>
             <w:r>
               <w:rPr>
                 <w:rFonts w:ascii="Courier New" w:eastAsia="Courier New" w:hAnsi="Courier New" w:cs="Courier New"/>
                 <w:sz w:val="18"/>
               </w:rPr>
-              <w:t>, 'r') as</w:t>
-            </w:r>
+              <w:t>f: n_channels = int(f['nbchan</w:t>
+            </w:r>
+            <w:proofErr w:type="gramStart"/>
             <w:r>
               <w:rPr>
                 <w:rFonts w:ascii="Courier New" w:eastAsia="Courier New" w:hAnsi="Courier New" w:cs="Courier New"/>
                 <w:sz w:val="18"/>
               </w:rPr>
-              <w:t xml:space="preserve"> </w:t>
-            </w:r>
+              <w:t>'][</w:t>
+            </w:r>
+            <w:proofErr w:type="gramEnd"/>
             <w:r>
               <w:rPr>
                 <w:rFonts w:ascii="Courier New" w:eastAsia="Courier New" w:hAnsi="Courier New" w:cs="Courier New"/>
                 <w:sz w:val="18"/>
               </w:rPr>
-              <w:t xml:space="preserve">f: </w:t>
-            </w:r>
-            <w:proofErr w:type="spellStart"/>
+              <w:t>0, 0]) n_samples = int(f['pnts</w:t>
+            </w:r>
+            <w:proofErr w:type="gramStart"/>
             <w:r>
               <w:rPr>
                 <w:rFonts w:ascii="Courier New" w:eastAsia="Courier New" w:hAnsi="Courier New" w:cs="Courier New"/>
                 <w:sz w:val="18"/>
               </w:rPr>
-              <w:t>n_channels</w:t>
-            </w:r>
-            <w:proofErr w:type="spellEnd"/>
+              <w:t>'][</w:t>
+            </w:r>
+            <w:proofErr w:type="gramEnd"/>
             <w:r>
               <w:rPr>
                 <w:rFonts w:ascii="Courier New" w:eastAsia="Courier New" w:hAnsi="Courier New" w:cs="Courier New"/>
                 <w:sz w:val="18"/>
               </w:rPr>
-              <w:t xml:space="preserve"> = int(f['</w:t>
-            </w:r>
-            <w:proofErr w:type="spellStart"/>
+              <w:t>0, 0])</w:t>
+            </w:r>
+          </w:p>
+          <w:p>
+            <w:pPr>
+              <w:spacing w:after="0" w:line="259" w:lineRule="auto"/>
+              <w:ind w:left="0" w:right="2825" w:firstLine="0"/>
+              <w:jc w:val="left"/>
+            </w:pPr>
             <w:r>
               <w:rPr>
                 <w:rFonts w:ascii="Courier New" w:eastAsia="Courier New" w:hAnsi="Courier New" w:cs="Courier New"/>
                 <w:sz w:val="18"/>
               </w:rPr>
-              <w:t>nbchan</w:t>
-            </w:r>
-            <w:proofErr w:type="spellEnd"/>
+              <w:t xml:space="preserve">data = </w:t>
+            </w:r>
             <w:proofErr w:type="gramStart"/>
             <w:r>
               <w:rPr>
                 <w:rFonts w:ascii="Courier New" w:eastAsia="Courier New" w:hAnsi="Courier New" w:cs="Courier New"/>
                 <w:sz w:val="18"/>
               </w:rPr>
-              <w:t>'][</w:t>
+              <w:t>np.fromfile</w:t>
             </w:r>
             <w:proofErr w:type="gramEnd"/>
             <w:r>
@@ -660,185 +593,39 @@
                 <w:rFonts w:ascii="Courier New" w:eastAsia="Courier New" w:hAnsi="Courier New" w:cs="Courier New"/>
                 <w:sz w:val="18"/>
               </w:rPr>
-              <w:t xml:space="preserve">0, 0]) </w:t>
-            </w:r>
-            <w:proofErr w:type="spellStart"/>
+              <w:t>(fdt_path, dtype=</w:t>
+            </w:r>
+            <w:proofErr w:type="gramStart"/>
             <w:r>
               <w:rPr>
                 <w:rFonts w:ascii="Courier New" w:eastAsia="Courier New" w:hAnsi="Courier New" w:cs="Courier New"/>
                 <w:sz w:val="18"/>
               </w:rPr>
-              <w:t>n_samples</w:t>
-            </w:r>
-            <w:proofErr w:type="spellEnd"/>
+              <w:t>np.float</w:t>
+            </w:r>
+            <w:proofErr w:type="gramEnd"/>
             <w:r>
               <w:rPr>
                 <w:rFonts w:ascii="Courier New" w:eastAsia="Courier New" w:hAnsi="Courier New" w:cs="Courier New"/>
                 <w:sz w:val="18"/>
               </w:rPr>
-              <w:t xml:space="preserve"> = int(f['</w:t>
-            </w:r>
-            <w:proofErr w:type="spellStart"/>
+              <w:t xml:space="preserve">32) data = </w:t>
+            </w:r>
+            <w:proofErr w:type="gramStart"/>
             <w:r>
               <w:rPr>
                 <w:rFonts w:ascii="Courier New" w:eastAsia="Courier New" w:hAnsi="Courier New" w:cs="Courier New"/>
                 <w:sz w:val="18"/>
               </w:rPr>
-              <w:t>pnts</w:t>
-            </w:r>
-            <w:proofErr w:type="gramStart"/>
+              <w:t>data.reshape</w:t>
+            </w:r>
+            <w:proofErr w:type="gramEnd"/>
             <w:r>
               <w:rPr>
                 <w:rFonts w:ascii="Courier New" w:eastAsia="Courier New" w:hAnsi="Courier New" w:cs="Courier New"/>
                 <w:sz w:val="18"/>
               </w:rPr>
-              <w:t>'</w:t>
-            </w:r>
-            <w:proofErr w:type="spellEnd"/>
-            <w:r>
-              <w:rPr>
-                <w:rFonts w:ascii="Courier New" w:eastAsia="Courier New" w:hAnsi="Courier New" w:cs="Courier New"/>
-                <w:sz w:val="18"/>
-              </w:rPr>
-              <w:t>][</w:t>
-            </w:r>
-            <w:proofErr w:type="gramEnd"/>
-            <w:r>
-              <w:rPr>
-                <w:rFonts w:ascii="Courier New" w:eastAsia="Courier New" w:hAnsi="Courier New" w:cs="Courier New"/>
-                <w:sz w:val="18"/>
-              </w:rPr>
-              <w:t>0, 0])</w:t>
-            </w:r>
-          </w:p>
-          <w:p>
-            <w:pPr>
-              <w:spacing w:after="0" w:line="259" w:lineRule="auto"/>
-              <w:ind w:left="0" w:right="2825" w:firstLine="0"/>
-              <w:jc w:val="left"/>
-            </w:pPr>
-            <w:r>
-              <w:rPr>
-                <w:rFonts w:ascii="Courier New" w:eastAsia="Courier New" w:hAnsi="Courier New" w:cs="Courier New"/>
-                <w:sz w:val="18"/>
-              </w:rPr>
-              <w:t xml:space="preserve">data = </w:t>
-            </w:r>
-            <w:proofErr w:type="spellStart"/>
-            <w:proofErr w:type="gramStart"/>
-            <w:r>
-              <w:rPr>
-                <w:rFonts w:ascii="Courier New" w:eastAsia="Courier New" w:hAnsi="Courier New" w:cs="Courier New"/>
-                <w:sz w:val="18"/>
-              </w:rPr>
-              <w:t>np.fromfile</w:t>
-            </w:r>
-            <w:proofErr w:type="spellEnd"/>
-            <w:proofErr w:type="gramEnd"/>
-            <w:r>
-              <w:rPr>
-                <w:rFonts w:ascii="Courier New" w:eastAsia="Courier New" w:hAnsi="Courier New" w:cs="Courier New"/>
-                <w:sz w:val="18"/>
-              </w:rPr>
-              <w:t>(</w:t>
-            </w:r>
-            <w:proofErr w:type="spellStart"/>
-            <w:r>
-              <w:rPr>
-                <w:rFonts w:ascii="Courier New" w:eastAsia="Courier New" w:hAnsi="Courier New" w:cs="Courier New"/>
-                <w:sz w:val="18"/>
-              </w:rPr>
-              <w:t>fdt_path</w:t>
-            </w:r>
-            <w:proofErr w:type="spellEnd"/>
-            <w:r>
-              <w:rPr>
-                <w:rFonts w:ascii="Courier New" w:eastAsia="Courier New" w:hAnsi="Courier New" w:cs="Courier New"/>
-                <w:sz w:val="18"/>
-              </w:rPr>
-              <w:t xml:space="preserve">, </w:t>
-            </w:r>
-            <w:proofErr w:type="spellStart"/>
-            <w:r>
-              <w:rPr>
-                <w:rFonts w:ascii="Courier New" w:eastAsia="Courier New" w:hAnsi="Courier New" w:cs="Courier New"/>
-                <w:sz w:val="18"/>
-              </w:rPr>
-              <w:t>dtype</w:t>
-            </w:r>
-            <w:proofErr w:type="spellEnd"/>
-            <w:r>
-              <w:rPr>
-                <w:rFonts w:ascii="Courier New" w:eastAsia="Courier New" w:hAnsi="Courier New" w:cs="Courier New"/>
-                <w:sz w:val="18"/>
-              </w:rPr>
-              <w:t>=</w:t>
-            </w:r>
-            <w:proofErr w:type="gramStart"/>
-            <w:r>
-              <w:rPr>
-                <w:rFonts w:ascii="Courier New" w:eastAsia="Courier New" w:hAnsi="Courier New" w:cs="Courier New"/>
-                <w:sz w:val="18"/>
-              </w:rPr>
-              <w:t>np.float</w:t>
-            </w:r>
-            <w:proofErr w:type="gramEnd"/>
-            <w:r>
-              <w:rPr>
-                <w:rFonts w:ascii="Courier New" w:eastAsia="Courier New" w:hAnsi="Courier New" w:cs="Courier New"/>
-                <w:sz w:val="18"/>
-              </w:rPr>
-              <w:t xml:space="preserve">32) data = </w:t>
-            </w:r>
-            <w:proofErr w:type="spellStart"/>
-            <w:proofErr w:type="gramStart"/>
-            <w:r>
-              <w:rPr>
-                <w:rFonts w:ascii="Courier New" w:eastAsia="Courier New" w:hAnsi="Courier New" w:cs="Courier New"/>
-                <w:sz w:val="18"/>
-              </w:rPr>
-              <w:t>data.reshape</w:t>
-            </w:r>
-            <w:proofErr w:type="spellEnd"/>
-            <w:proofErr w:type="gramEnd"/>
-            <w:r>
-              <w:rPr>
-                <w:rFonts w:ascii="Courier New" w:eastAsia="Courier New" w:hAnsi="Courier New" w:cs="Courier New"/>
-                <w:sz w:val="18"/>
-              </w:rPr>
-              <w:t>((</w:t>
-            </w:r>
-            <w:proofErr w:type="spellStart"/>
-            <w:r>
-              <w:rPr>
-                <w:rFonts w:ascii="Courier New" w:eastAsia="Courier New" w:hAnsi="Courier New" w:cs="Courier New"/>
-                <w:sz w:val="18"/>
-              </w:rPr>
-              <w:t>n_channels</w:t>
-            </w:r>
-            <w:proofErr w:type="spellEnd"/>
-            <w:r>
-              <w:rPr>
-                <w:rFonts w:ascii="Courier New" w:eastAsia="Courier New" w:hAnsi="Courier New" w:cs="Courier New"/>
-                <w:sz w:val="18"/>
-              </w:rPr>
-              <w:t xml:space="preserve">, </w:t>
-            </w:r>
-            <w:proofErr w:type="spellStart"/>
-            <w:r>
-              <w:rPr>
-                <w:rFonts w:ascii="Courier New" w:eastAsia="Courier New" w:hAnsi="Courier New" w:cs="Courier New"/>
-                <w:sz w:val="18"/>
-              </w:rPr>
-              <w:t>n_samples</w:t>
-            </w:r>
-            <w:proofErr w:type="spellEnd"/>
-            <w:r>
-              <w:rPr>
-                <w:rFonts w:ascii="Courier New" w:eastAsia="Courier New" w:hAnsi="Courier New" w:cs="Courier New"/>
-                <w:sz w:val="18"/>
-              </w:rPr>
-              <w:t>), order='F')</w:t>
+              <w:t>((n_channels, n_samples), order='F')</w:t>
             </w:r>
           </w:p>
         </w:tc>
@@ -848,6 +635,11 @@
       <w:pPr>
         <w:ind w:left="-5" w:right="0"/>
       </w:pPr>
+    </w:p>
+    <w:p>
+      <w:pPr>
+        <w:ind w:left="-5" w:right="0"/>
+      </w:pPr>
       <w:r>
         <w:t xml:space="preserve">Without </w:t>
       </w:r>
@@ -879,7 +671,7 @@
         <w:ind w:left="-5" w:right="0"/>
       </w:pPr>
       <w:r>
-        <w:t>Once loading worked, I selected 7 frontal channels and extracted 17,283 two-second windows (500 samples each at 250 Hz) with 50% overlap across all 35 subjects. Subject-level splits: 24 train (11,736 windows), 5 validation (2,725 windows), 6 test (2,822 windows).</w:t>
+        <w:t>I selected 7 frontal channels and extracted 17,283 two-second windows (500 samples each at 250 Hz) with 50% overlap across all 35 subjects. Subject-level splits: 24 train (11,736 windows), 5 validation (2,725 windows), 6 test (2,822 windows).</w:t>
       </w:r>
     </w:p>
     <w:p>
@@ -892,7 +684,13 @@
       </w:r>
       <w:proofErr w:type="gramEnd"/>
       <w:r>
-        <w:t xml:space="preserve"> I implemented Phase-Amplitude Coupling using the Tort Modulation Index. The method bandpass filters for θ (4-8 Hz) phase and γ (38-42 Hz) amplitude, applies the Hilbert transform to extract instantaneous phase and amplitude, bins γ amplitude by θ phase (18 bins of 20 degrees each), normalizes to a probability distribution, and computes the KL divergence from uniform. I computed PAC at epoch level (full 20-40 second stimulation blocks), then assigned the value uniformly to constituent 2-second windows. This creates label sharing within epochs but ensures reliable MI estimates. PAC values ranged from about 6</w:t>
+        <w:t xml:space="preserve"> I implemented Phase-Amplitude Coupling using the Tort Modulation Index</w:t>
+      </w:r>
+      <w:r>
+        <w:t xml:space="preserve"> method</w:t>
+      </w:r>
+      <w:r>
+        <w:t>. The method bandpass filters for θ (4-8 Hz) phase and γ (38-42 Hz) amplitude, applies the Hilbert transform to extract instantaneous phase and amplitude, bins γ amplitude by θ phase (18 bins of 20 degrees each), normalizes to a probability distribution, and computes the KL divergence from uniform. I computed PAC at epoch level (full 20-40 second stimulation blocks), then assigned the value uniformly to constituent 2-second windows. This creates label sharing within epochs but ensures reliable MI estimates. PAC values ranged from about 6</w:t>
       </w:r>
       <w:r>
         <w:t>*</w:t>
@@ -913,13 +711,17 @@
         <w:ind w:left="-5" w:right="0"/>
       </w:pPr>
       <w:r>
-        <w:t xml:space="preserve">With data loaded and labeled, I built the first model: EEGNet (Lawhern et al., 2018), adapted from classification to regression. EEGNet uses temporal convolutions followed by </w:t>
-      </w:r>
-      <w:proofErr w:type="spellStart"/>
-      <w:r>
-        <w:t>depthwise</w:t>
-      </w:r>
-      <w:proofErr w:type="spellEnd"/>
+        <w:t xml:space="preserve">With data loaded and labeled, I built the first model EEGNet (Lawhern et al., 2018), </w:t>
+      </w:r>
+      <w:r>
+        <w:t xml:space="preserve">for </w:t>
+      </w:r>
+      <w:r>
+        <w:t xml:space="preserve">regression. EEGNet uses temporal convolutions followed by </w:t>
+      </w:r>
+      <w:r>
+        <w:t>depth wise</w:t>
+      </w:r>
       <w:r>
         <w:t xml:space="preserve"> spatial convolutions that capture channel relationships, which makes it well-suited for EEG. My adaptation replaced the classification head with a single linear output neuron for continuous PAC prediction:</w:t>
       </w:r>
@@ -936,7 +738,21 @@
           <w:rFonts w:ascii="Courier New" w:eastAsia="Courier New" w:hAnsi="Courier New" w:cs="Courier New"/>
           <w:sz w:val="18"/>
         </w:rPr>
-        <w:t>Input: (batch, 1, 7, 500) -- 7 channels x 500 samples</w:t>
+        <w:t>Input: (batch, 1, 7, 500) -</w:t>
+      </w:r>
+      <w:r>
+        <w:rPr>
+          <w:rFonts w:ascii="Courier New" w:eastAsia="Courier New" w:hAnsi="Courier New" w:cs="Courier New"/>
+          <w:sz w:val="18"/>
+        </w:rPr>
+        <w:t>&gt;</w:t>
+      </w:r>
+      <w:r>
+        <w:rPr>
+          <w:rFonts w:ascii="Courier New" w:eastAsia="Courier New" w:hAnsi="Courier New" w:cs="Courier New"/>
+          <w:sz w:val="18"/>
+        </w:rPr>
+        <w:t xml:space="preserve"> 7 channels x 500 samples</w:t>
       </w:r>
     </w:p>
     <w:p>
@@ -977,21 +793,12 @@
         <w:ind w:left="235" w:right="127"/>
         <w:jc w:val="left"/>
       </w:pPr>
-      <w:proofErr w:type="spellStart"/>
       <w:r>
         <w:rPr>
           <w:rFonts w:ascii="Courier New" w:eastAsia="Courier New" w:hAnsi="Courier New" w:cs="Courier New"/>
           <w:sz w:val="18"/>
         </w:rPr>
-        <w:t>Depthwise</w:t>
-      </w:r>
-      <w:proofErr w:type="spellEnd"/>
-      <w:r>
-        <w:rPr>
-          <w:rFonts w:ascii="Courier New" w:eastAsia="Courier New" w:hAnsi="Courier New" w:cs="Courier New"/>
-          <w:sz w:val="18"/>
-        </w:rPr>
-        <w:t xml:space="preserve"> Spatial: 16 filters, kernel</w:t>
+        <w:t>Depthwise Spatial: 16 filters, kernel</w:t>
       </w:r>
       <w:proofErr w:type="gramStart"/>
       <w:r>
@@ -1022,23 +829,7 @@
           <w:rFonts w:ascii="Courier New" w:eastAsia="Courier New" w:hAnsi="Courier New" w:cs="Courier New"/>
           <w:sz w:val="18"/>
         </w:rPr>
-        <w:t xml:space="preserve">ELU + </w:t>
-      </w:r>
-      <w:proofErr w:type="spellStart"/>
-      <w:r>
-        <w:rPr>
-          <w:rFonts w:ascii="Courier New" w:eastAsia="Courier New" w:hAnsi="Courier New" w:cs="Courier New"/>
-          <w:sz w:val="18"/>
-        </w:rPr>
-        <w:t>AvgPool</w:t>
-      </w:r>
-      <w:proofErr w:type="spellEnd"/>
-      <w:r>
-        <w:rPr>
-          <w:rFonts w:ascii="Courier New" w:eastAsia="Courier New" w:hAnsi="Courier New" w:cs="Courier New"/>
-          <w:sz w:val="18"/>
-        </w:rPr>
-        <w:t xml:space="preserve"> + </w:t>
+        <w:t xml:space="preserve">ELU + AvgPool + </w:t>
       </w:r>
       <w:proofErr w:type="gramStart"/>
       <w:r>
@@ -1084,23 +875,7 @@
           <w:rFonts w:ascii="Courier New" w:eastAsia="Courier New" w:hAnsi="Courier New" w:cs="Courier New"/>
           <w:sz w:val="18"/>
         </w:rPr>
-        <w:t xml:space="preserve">ELU + </w:t>
-      </w:r>
-      <w:proofErr w:type="spellStart"/>
-      <w:r>
-        <w:rPr>
-          <w:rFonts w:ascii="Courier New" w:eastAsia="Courier New" w:hAnsi="Courier New" w:cs="Courier New"/>
-          <w:sz w:val="18"/>
-        </w:rPr>
-        <w:t>AvgPool</w:t>
-      </w:r>
-      <w:proofErr w:type="spellEnd"/>
-      <w:r>
-        <w:rPr>
-          <w:rFonts w:ascii="Courier New" w:eastAsia="Courier New" w:hAnsi="Courier New" w:cs="Courier New"/>
-          <w:sz w:val="18"/>
-        </w:rPr>
-        <w:t xml:space="preserve"> + </w:t>
+        <w:t xml:space="preserve">ELU + AvgPool + </w:t>
       </w:r>
       <w:proofErr w:type="gramStart"/>
       <w:r>
@@ -1170,39 +945,7 @@
         <w:ind w:left="-5" w:right="0"/>
       </w:pPr>
       <w:r>
-        <w:t>Training used MSE loss, Adam optimizer (</w:t>
-      </w:r>
-      <w:proofErr w:type="spellStart"/>
-      <w:r>
-        <w:t>lr</w:t>
-      </w:r>
-      <w:proofErr w:type="spellEnd"/>
-      <w:r>
-        <w:t xml:space="preserve">=0.001, </w:t>
-      </w:r>
-      <w:proofErr w:type="spellStart"/>
-      <w:r>
-        <w:t>weight_decay</w:t>
-      </w:r>
-      <w:proofErr w:type="spellEnd"/>
-      <w:r>
-        <w:t xml:space="preserve">=0.0001), gradient clipping (max_norm=1.0), </w:t>
-      </w:r>
-      <w:proofErr w:type="spellStart"/>
-      <w:r>
-        <w:t>ReduceLROnPlateau</w:t>
-      </w:r>
-      <w:proofErr w:type="spellEnd"/>
-      <w:r>
-        <w:t xml:space="preserve"> scheduler, and early stopping with patience of 15 epochs. The result: test R² = 0.287, with inference time under 1 </w:t>
-      </w:r>
-      <w:proofErr w:type="spellStart"/>
-      <w:r>
-        <w:t>ms</w:t>
-      </w:r>
-      <w:proofErr w:type="spellEnd"/>
-      <w:r>
-        <w:t xml:space="preserve"> on Apple Silicon MPS.</w:t>
+        <w:t>Training used MSE loss, Adam optimizer (lr=0.001, weight_decay=0.0001), gradient clipping (max_norm=1.0), ReduceLROnPlateau scheduler, and early stopping with patience of 15 epochs. The result: test R² = 0.287, with inference time under 1 ms on Apple Silicon MPS.</w:t>
       </w:r>
     </w:p>
     <w:p>
@@ -1210,25 +953,13 @@
         <w:ind w:left="-5" w:right="0"/>
       </w:pPr>
       <w:r>
-        <w:t>That R² seemed modest, but at this point I assumed architectural improvements could push it higher. The pipeline was finally end-to-end: raw BIDS data in, trained model out, controller skeleton ready for integration.</w:t>
-      </w:r>
-    </w:p>
-    <w:p>
-      <w:pPr>
-        <w:spacing w:after="160" w:line="278" w:lineRule="auto"/>
-        <w:ind w:left="0" w:right="0" w:firstLine="0"/>
-        <w:jc w:val="left"/>
-        <w:rPr>
-          <w:b/>
-          <w:color w:val="000000" w:themeColor="text1"/>
-          <w:sz w:val="28"/>
-        </w:rPr>
-      </w:pPr>
-      <w:r>
-        <w:rPr>
-          <w:color w:val="000000" w:themeColor="text1"/>
-        </w:rPr>
-        <w:br w:type="page"/>
+        <w:t>That R² seem</w:t>
+      </w:r>
+      <w:r>
+        <w:t>s low</w:t>
+      </w:r>
+      <w:r>
+        <w:t xml:space="preserve">, but architectural improvements could push it higher. </w:t>
       </w:r>
     </w:p>
     <w:p>
@@ -1246,7 +977,7 @@
           <w:u w:val="none"/>
         </w:rPr>
         <w:lastRenderedPageBreak/>
-        <w:t>February 16, 2026 – Architecture Marathon and the R² = 0.287 Ceiling</w:t>
+        <w:t>February 16, 2026</w:t>
       </w:r>
     </w:p>
     <w:p>
@@ -1254,13 +985,25 @@
         <w:ind w:left="-5" w:right="0"/>
       </w:pPr>
       <w:r>
-        <w:rPr>
-          <w:bCs/>
-        </w:rPr>
-        <w:t>This</w:t>
-      </w:r>
-      <w:r>
-        <w:t xml:space="preserve"> was the most instructive day of the project, and most of the instruction came from failure.</w:t>
+        <w:t xml:space="preserve">I tested multiple architectures </w:t>
+      </w:r>
+      <w:r>
+        <w:t xml:space="preserve">with different </w:t>
+      </w:r>
+      <w:r>
+        <w:t>parameter count</w:t>
+      </w:r>
+      <w:r>
+        <w:t>s</w:t>
+      </w:r>
+      <w:r>
+        <w:t xml:space="preserve">. </w:t>
+      </w:r>
+      <w:r>
+        <w:t xml:space="preserve">Used </w:t>
+      </w:r>
+      <w:r>
+        <w:t>EEGNet variants, spectral-temporal hybrids, transformer-based approaches, and simple baselines for comparison.</w:t>
       </w:r>
     </w:p>
     <w:p>
@@ -1268,7 +1011,19 @@
         <w:ind w:left="-5" w:right="0"/>
       </w:pPr>
       <w:r>
-        <w:t>Convinced that model capacity was the bottleneck, I tested multiple architectures across three orders of magnitude in parameter count. The plan was systematic: EEGNet variants, spectral-temporal hybrids, transformer-based approaches, and simple baselines for comparison.</w:t>
+        <w:rPr>
+          <w:b/>
+        </w:rPr>
+        <w:t>EEGNet (baseline, V1)</w:t>
+      </w:r>
+      <w:r>
+        <w:t xml:space="preserve"> </w:t>
+      </w:r>
+      <w:r>
+        <w:t xml:space="preserve">- </w:t>
+      </w:r>
+      <w:r>
+        <w:t xml:space="preserve">1,457 parameters. Test R² = 0.287. </w:t>
       </w:r>
     </w:p>
     <w:p>
@@ -1279,195 +1034,95 @@
         <w:rPr>
           <w:b/>
         </w:rPr>
-        <w:t>EEGNet (baseline, V1)</w:t>
-      </w:r>
-      <w:r>
-        <w:t xml:space="preserve"> – 1,457 parameters. Test R² = 0.287. Already established on Feb 6.</w:t>
-      </w:r>
-    </w:p>
-    <w:p>
-      <w:pPr>
-        <w:ind w:left="-5" w:right="0"/>
-      </w:pPr>
+        <w:t>EEGNetV2 (delta</w:t>
+      </w:r>
       <w:r>
         <w:rPr>
           <w:b/>
         </w:rPr>
-        <w:t>EEGNetV2 (delta-PAC prediction)</w:t>
-      </w:r>
-      <w:r>
-        <w:t xml:space="preserve"> – ~3,200 parameters. Predicted PAC change instead of absolute PAC. Test R² = 0.06. Delta prediction failed because temporal changes at 2-second resolution are too noisy.</w:t>
+        <w:t xml:space="preserve"> </w:t>
+      </w:r>
+      <w:r>
+        <w:rPr>
+          <w:b/>
+        </w:rPr>
+        <w:t>PAC prediction)</w:t>
+      </w:r>
+      <w:r>
+        <w:t xml:space="preserve"> </w:t>
+      </w:r>
+      <w:r>
+        <w:t>-</w:t>
+      </w:r>
+      <w:r>
+        <w:t xml:space="preserve"> ~3,200 parameters. Predicted PAC change instead of absolute PAC. Test R² = 0.06. Delta prediction failed because temporal changes at 2-second resolution are</w:t>
+      </w:r>
+      <w:r>
+        <w:t xml:space="preserve"> probably</w:t>
+      </w:r>
+      <w:r>
+        <w:t xml:space="preserve"> too noisy.</w:t>
       </w:r>
     </w:p>
     <w:p>
       <w:pPr>
         <w:spacing w:after="0"/>
         <w:ind w:left="-5" w:right="0"/>
-      </w:pPr>
-      <w:r>
-        <w:rPr>
-          <w:b/>
-        </w:rPr>
-        <w:t>SpecTempNet (spectral-temporal hybrid, V3)</w:t>
-      </w:r>
-      <w:r>
-        <w:t xml:space="preserve"> – 180,000 parameters. This one was the gut punch.</w:t>
-      </w:r>
-    </w:p>
-    <w:p>
-      <w:pPr>
-        <w:spacing w:after="152"/>
-        <w:ind w:left="-5" w:right="0"/>
-      </w:pPr>
-      <w:r>
-        <w:t>Initial result: R² = 0.69. I was excited – until I looked at the feature correlations and found that PAC-derived features in the input directly encoded the target. Ridge analysis confirmed: PAC features carried 96.6% of the total model weight. After removing the circular features: R² = 0.236. The "breakthrough" was leakage.</w:t>
-      </w:r>
-    </w:p>
-    <w:p>
-      <w:pPr>
-        <w:shd w:val="clear" w:color="auto" w:fill="F0F0F0"/>
-        <w:spacing w:after="240" w:line="259" w:lineRule="auto"/>
-        <w:ind w:left="235" w:right="1222"/>
-        <w:jc w:val="left"/>
-      </w:pPr>
-      <w:r>
         <w:rPr>
           <w:rFonts w:ascii="Courier New" w:eastAsia="Courier New" w:hAnsi="Courier New" w:cs="Courier New"/>
           <w:sz w:val="18"/>
         </w:rPr>
-        <w:t xml:space="preserve"># Found the problem: high correlation between input features and target </w:t>
-      </w:r>
-      <w:proofErr w:type="spellStart"/>
+      </w:pPr>
+      <w:r>
+        <w:rPr>
+          <w:b/>
+        </w:rPr>
+        <w:t>SpecTempNet (spectral-temporal hybrid, V3)</w:t>
+      </w:r>
+      <w:r>
+        <w:t xml:space="preserve"> </w:t>
+      </w:r>
+      <w:r>
+        <w:t>-</w:t>
+      </w:r>
+      <w:r>
+        <w:t xml:space="preserve"> 180,000 parameters.</w:t>
+      </w:r>
+      <w:r>
+        <w:t xml:space="preserve"> </w:t>
+      </w:r>
+      <w:r>
+        <w:t xml:space="preserve">Initial result: R² = </w:t>
+      </w:r>
+      <w:proofErr w:type="gramStart"/>
+      <w:r>
+        <w:t>0.69</w:t>
+      </w:r>
+      <w:r>
+        <w:t>!!</w:t>
+      </w:r>
+      <w:proofErr w:type="gramEnd"/>
+      <w:r>
+        <w:t xml:space="preserve"> But I</w:t>
+      </w:r>
+      <w:r>
+        <w:t xml:space="preserve"> found that PAC-derived features in the input directly encoded the target. Ridge analysis confirmed</w:t>
+      </w:r>
+      <w:r>
+        <w:t xml:space="preserve"> that the </w:t>
+      </w:r>
+      <w:r>
+        <w:t xml:space="preserve">PAC features carried 96.6% of the total model weight. After removing the circular features: R² = 0.236. </w:t>
+      </w:r>
+      <w:r>
+        <w:t>Data leakage</w:t>
+      </w:r>
       <w:r>
         <w:rPr>
           <w:rFonts w:ascii="Courier New" w:eastAsia="Courier New" w:hAnsi="Courier New" w:cs="Courier New"/>
           <w:sz w:val="18"/>
         </w:rPr>
-        <w:t>pac_features_correlation</w:t>
-      </w:r>
-      <w:proofErr w:type="spellEnd"/>
-      <w:r>
-        <w:rPr>
-          <w:rFonts w:ascii="Courier New" w:eastAsia="Courier New" w:hAnsi="Courier New" w:cs="Courier New"/>
-          <w:sz w:val="18"/>
-        </w:rPr>
-        <w:t xml:space="preserve"> = </w:t>
-      </w:r>
-      <w:proofErr w:type="spellStart"/>
-      <w:proofErr w:type="gramStart"/>
-      <w:r>
-        <w:rPr>
-          <w:rFonts w:ascii="Courier New" w:eastAsia="Courier New" w:hAnsi="Courier New" w:cs="Courier New"/>
-          <w:sz w:val="18"/>
-        </w:rPr>
-        <w:t>np.corrcoef</w:t>
-      </w:r>
-      <w:proofErr w:type="spellEnd"/>
-      <w:proofErr w:type="gramEnd"/>
-      <w:r>
-        <w:rPr>
-          <w:rFonts w:ascii="Courier New" w:eastAsia="Courier New" w:hAnsi="Courier New" w:cs="Courier New"/>
-          <w:sz w:val="18"/>
-        </w:rPr>
-        <w:t>(</w:t>
-      </w:r>
-      <w:proofErr w:type="spellStart"/>
-      <w:r>
-        <w:rPr>
-          <w:rFonts w:ascii="Courier New" w:eastAsia="Courier New" w:hAnsi="Courier New" w:cs="Courier New"/>
-          <w:sz w:val="18"/>
-        </w:rPr>
-        <w:t>pac_features</w:t>
-      </w:r>
-      <w:proofErr w:type="spellEnd"/>
-      <w:r>
-        <w:rPr>
-          <w:rFonts w:ascii="Courier New" w:eastAsia="Courier New" w:hAnsi="Courier New" w:cs="Courier New"/>
-          <w:sz w:val="18"/>
-        </w:rPr>
-        <w:t xml:space="preserve">, </w:t>
-      </w:r>
-      <w:proofErr w:type="spellStart"/>
-      <w:r>
-        <w:rPr>
-          <w:rFonts w:ascii="Courier New" w:eastAsia="Courier New" w:hAnsi="Courier New" w:cs="Courier New"/>
-          <w:sz w:val="18"/>
-        </w:rPr>
-        <w:t>pac_</w:t>
-      </w:r>
-      <w:proofErr w:type="gramStart"/>
-      <w:r>
-        <w:rPr>
-          <w:rFonts w:ascii="Courier New" w:eastAsia="Courier New" w:hAnsi="Courier New" w:cs="Courier New"/>
-          <w:sz w:val="18"/>
-        </w:rPr>
-        <w:t>targets</w:t>
-      </w:r>
-      <w:proofErr w:type="spellEnd"/>
-      <w:r>
-        <w:rPr>
-          <w:rFonts w:ascii="Courier New" w:eastAsia="Courier New" w:hAnsi="Courier New" w:cs="Courier New"/>
-          <w:sz w:val="18"/>
-        </w:rPr>
-        <w:t>)[</w:t>
-      </w:r>
-      <w:proofErr w:type="gramEnd"/>
-      <w:r>
-        <w:rPr>
-          <w:rFonts w:ascii="Courier New" w:eastAsia="Courier New" w:hAnsi="Courier New" w:cs="Courier New"/>
-          <w:sz w:val="18"/>
-        </w:rPr>
-        <w:t>0,1] # Result: r = 0.73 -- clearly circular</w:t>
-      </w:r>
-    </w:p>
-    <w:p>
-      <w:pPr>
-        <w:ind w:left="-5" w:right="0"/>
-      </w:pPr>
-      <w:r>
-        <w:t>This was a critical learning moment. Feature leakage can produce results that look valid until scrutinized.</w:t>
-      </w:r>
-    </w:p>
-    <w:p>
-      <w:pPr>
-        <w:ind w:left="-5" w:right="0"/>
-      </w:pPr>
-      <w:r>
-        <w:rPr>
-          <w:b/>
-        </w:rPr>
-        <w:t>ViT-TCNet (Vision Transformer + TCN, V4)</w:t>
-      </w:r>
-      <w:r>
-        <w:t xml:space="preserve"> – ~2,000,000 parameters. Treated EEG as image patches plus temporal convolution. Test R² = 0.252. Severe overfitting with a samples-to-parameters ratio of 0.006 on only 11K training samples.</w:t>
-      </w:r>
-    </w:p>
-    <w:p>
-      <w:pPr>
-        <w:ind w:left="-5" w:right="0"/>
-      </w:pPr>
-      <w:r>
-        <w:rPr>
-          <w:b/>
-        </w:rPr>
-        <w:t>Ridge Regression (sanity check, V5)</w:t>
-      </w:r>
-      <w:r>
-        <w:t xml:space="preserve"> – 135 coefficients. Spectral power features, no PAC features. Test R² = 0.287. This was the shocking result: the simplest possible model matched EEGNet exactly.</w:t>
-      </w:r>
-    </w:p>
-    <w:p>
-      <w:pPr>
-        <w:ind w:left="-5" w:right="0"/>
-      </w:pPr>
-      <w:r>
-        <w:rPr>
-          <w:b/>
-        </w:rPr>
-        <w:t>ATCNet (attention-based TCN, V6)</w:t>
-      </w:r>
-      <w:r>
-        <w:t xml:space="preserve"> – ~25,000 parameters. Test R² = 0.075.</w:t>
+        <w:t>.</w:t>
       </w:r>
     </w:p>
     <w:p>
@@ -1475,15 +1130,96 @@
         <w:spacing w:after="0"/>
         <w:ind w:left="-5" w:right="0"/>
       </w:pPr>
+    </w:p>
+    <w:p>
+      <w:pPr>
+        <w:ind w:left="-5" w:right="0"/>
+      </w:pPr>
       <w:r>
         <w:rPr>
           <w:b/>
         </w:rPr>
+        <w:t>ViT-TCNet (Vision Transformer + TCN, V4)</w:t>
+      </w:r>
+      <w:r>
+        <w:t xml:space="preserve"> </w:t>
+      </w:r>
+      <w:r>
+        <w:t>-</w:t>
+      </w:r>
+      <w:r>
+        <w:t xml:space="preserve"> ~2,000,000 parameters. Treated EEG as image patches plus temporal convolution. Test R² = 0.252. Severe overfitting with a samples-to-parameters ratio of 0.006 on only 11K training samples.</w:t>
+      </w:r>
+    </w:p>
+    <w:p>
+      <w:pPr>
+        <w:ind w:left="-5" w:right="0"/>
+      </w:pPr>
+      <w:r>
+        <w:rPr>
+          <w:b/>
+        </w:rPr>
+        <w:t>Ridge Regression (V5)</w:t>
+      </w:r>
+      <w:r>
+        <w:t xml:space="preserve"> </w:t>
+      </w:r>
+      <w:r>
+        <w:t xml:space="preserve">- </w:t>
+      </w:r>
+      <w:r>
+        <w:t xml:space="preserve">135 coefficients. Spectral power features, no PAC features. Test R² = 0.287. </w:t>
+      </w:r>
+      <w:r>
+        <w:t>It’s the exact same as EEGNet?</w:t>
+      </w:r>
+    </w:p>
+    <w:p>
+      <w:pPr>
+        <w:ind w:left="-5" w:right="0"/>
+      </w:pPr>
+      <w:r>
+        <w:rPr>
+          <w:b/>
+        </w:rPr>
+        <w:t>ATCNet (attention-based TCN, V6)</w:t>
+      </w:r>
+      <w:r>
+        <w:t xml:space="preserve"> </w:t>
+      </w:r>
+      <w:r>
+        <w:t>-</w:t>
+      </w:r>
+      <w:r>
+        <w:t xml:space="preserve"> ~25,000 parameters. Test R² = 0.075.</w:t>
+      </w:r>
+    </w:p>
+    <w:p>
+      <w:pPr>
+        <w:spacing w:after="0"/>
+        <w:ind w:left="-5" w:right="0"/>
+      </w:pPr>
+      <w:r>
+        <w:rPr>
+          <w:b/>
+        </w:rPr>
         <w:t>EEGNetLarge (scaled EEGNet)</w:t>
       </w:r>
       <w:r>
-        <w:t xml:space="preserve"> – 141,000 parameters. Test R² = 0.287. Same ceiling, 100x more parameters.</w:t>
-      </w:r>
+        <w:t xml:space="preserve"> </w:t>
+      </w:r>
+      <w:r>
+        <w:t>-</w:t>
+      </w:r>
+      <w:r>
+        <w:t xml:space="preserve"> 141,000 parameters. Test R² = 0.287. Same ceiling, 100x more parameters.</w:t>
+      </w:r>
+    </w:p>
+    <w:p>
+      <w:pPr>
+        <w:spacing w:after="0"/>
+        <w:ind w:left="-5" w:right="0"/>
+      </w:pPr>
     </w:p>
     <w:tbl>
       <w:tblPr>
@@ -1492,8 +1228,6 @@
         <w:tblInd w:w="-120" w:type="dxa"/>
         <w:tblCellMar>
           <w:top w:w="128" w:type="dxa"/>
-          <w:left w:w="0" w:type="dxa"/>
-          <w:bottom w:w="0" w:type="dxa"/>
           <w:right w:w="115" w:type="dxa"/>
         </w:tblCellMar>
         <w:tblLook w:val="04A0" w:firstRow="1" w:lastRow="0" w:firstColumn="1" w:lastColumn="0" w:noHBand="0" w:noVBand="1"/>
@@ -2052,16 +1786,8 @@
               <w:rPr>
                 <w:sz w:val="19"/>
               </w:rPr>
-              <w:t xml:space="preserve">135 </w:t>
-            </w:r>
-            <w:proofErr w:type="spellStart"/>
-            <w:r>
-              <w:rPr>
-                <w:sz w:val="19"/>
-              </w:rPr>
-              <w:t>coefs</w:t>
-            </w:r>
-            <w:proofErr w:type="spellEnd"/>
+              <w:t>135 coefs</w:t>
+            </w:r>
           </w:p>
         </w:tc>
         <w:tc>
@@ -2382,21 +2108,28 @@
       <w:pPr>
         <w:ind w:left="-5" w:right="0"/>
       </w:pPr>
-      <w:r>
-        <w:t xml:space="preserve">The pattern was unmistakable. The simplest models (EEGNet with 1,457 parameters, Ridge with 135 coefficients) matched the performance of models with 1,000x more parameters. R² = 0.287 was a data </w:t>
-      </w:r>
-      <w:r>
-        <w:lastRenderedPageBreak/>
-        <w:t>ceiling, not a model capacity limitation. The signal-to-noise ratio was approximately -4.73 dB (signal weaker than noise), and epoch-level PAC labels assigned to 2-second windows inherently limit single-window accuracy.</w:t>
-      </w:r>
-    </w:p>
-    <w:p>
-      <w:pPr>
-        <w:spacing w:after="812"/>
+    </w:p>
+    <w:p>
+      <w:pPr>
         <w:ind w:left="-5" w:right="0"/>
       </w:pPr>
       <w:r>
-        <w:t>This changed my thinking about the project. Trying to predict PAC better from a single 2-second window was hitting a fundamental limit. The question needed to change.</w:t>
+        <w:t xml:space="preserve">The simplest models (EEGNet with 1,457 parameters, Ridge with 135 coefficients) matched the performance of models with 1,000x more parameters. R² = 0.287 </w:t>
+      </w:r>
+      <w:r>
+        <w:t>is</w:t>
+      </w:r>
+      <w:r>
+        <w:t xml:space="preserve"> a data ceiling</w:t>
+      </w:r>
+      <w:r>
+        <w:t>?</w:t>
+      </w:r>
+      <w:r>
+        <w:t xml:space="preserve"> The signal-to-noise ratio was approximately -4.73 dB (signal weaker than noise), and epoch-level PAC labels assigned to 2-second windows inherently limit single-window accuracy.</w:t>
+      </w:r>
+      <w:r>
+        <w:t xml:space="preserve"> The question should probably change.</w:t>
       </w:r>
     </w:p>
     <w:p>
@@ -2428,7 +2161,7 @@
           <w:u w:val="none"/>
         </w:rPr>
         <w:lastRenderedPageBreak/>
-        <w:t>February 17, 2026 – Temporal Forecasting Pivot and Causal TCN</w:t>
+        <w:t>February 17, 2026</w:t>
       </w:r>
     </w:p>
     <w:p>
@@ -2436,7 +2169,25 @@
         <w:ind w:left="-5" w:right="0"/>
       </w:pPr>
       <w:r>
-        <w:t>I treated today as a genuine pivot. After hitting the 0.287 ceiling with six different architectures, the problem wasn't model capacity – it was problem formulation. Instead of asking "how accurately can we estimate current PAC?" I started asking "how far ahead can we predict future PAC?" If the system can forecast PAC 5-10 seconds into the future, a controller can intervene proactively before coupling declines, rather than reacting after the fact.</w:t>
+        <w:t>Pivoting the idea of the architecture.</w:t>
+      </w:r>
+      <w:r>
+        <w:t xml:space="preserve"> </w:t>
+      </w:r>
+      <w:r>
+        <w:t>The 0.287 is a data ceiling</w:t>
+      </w:r>
+      <w:r>
+        <w:t xml:space="preserve">. Instead of asking "how accurately can we estimate current PAC?" </w:t>
+      </w:r>
+      <w:r>
+        <w:t xml:space="preserve">the question should be </w:t>
+      </w:r>
+      <w:r>
+        <w:t>"how far ahead can we predict future PAC?" If the system can forecast PAC 5-10 seconds into the future, a controller can intervene proactively before coupling declines, rather than reacting after the fact.</w:t>
+      </w:r>
+      <w:r>
+        <w:t xml:space="preserve"> Enabling auditory stimulus takes time too.</w:t>
       </w:r>
     </w:p>
     <w:p>
@@ -2444,7 +2195,10 @@
         <w:ind w:left="-5" w:right="0"/>
       </w:pPr>
       <w:r>
-        <w:t>The first part of the day was designing the temporal feature representation. I built 73-dimensional feature vectors per timestep:</w:t>
+        <w:t>Part 1: design</w:t>
+      </w:r>
+      <w:r>
+        <w:t xml:space="preserve"> temporal feature representation. I built 73-dimensional feature vectors per timestep:</w:t>
       </w:r>
     </w:p>
     <w:p>
@@ -2458,7 +2212,7 @@
         <w:t>Spectral features (61 dimensions):</w:t>
       </w:r>
       <w:r>
-        <w:t xml:space="preserve"> Band power in delta (0.5-4 Hz), θ (4-8 Hz), alpha (8-12 Hz), beta (12-30 Hz), and γ (30-42 Hz) for each of 7 channels (35 features), plus 26 cross-channel coherence features.</w:t>
+        <w:t xml:space="preserve"> Band power in delta (0.5-4 Hz), θ (4-8 Hz), alpha (8-12 Hz), beta (12-30 Hz), and γ (30-42 Hz) for each of 7 channels (35 features), plus 26 cross-channel features.</w:t>
       </w:r>
     </w:p>
     <w:p>
@@ -2494,7 +2248,10 @@
         <w:ind w:left="-5" w:right="0"/>
       </w:pPr>
       <w:r>
-        <w:t>Every feature was strictly causal – no future information can leak into predictions. This constraint is essential for real-time deployment.</w:t>
+        <w:t xml:space="preserve">Every feature was causal </w:t>
+      </w:r>
+      <w:r>
+        <w:t>so there could be no data leakage like there was before.</w:t>
       </w:r>
     </w:p>
     <w:p>
@@ -2502,7 +2259,10 @@
         <w:ind w:left="-5" w:right="0"/>
       </w:pPr>
       <w:r>
-        <w:t>The sequence setup: 20 timesteps of lookback (20 seconds of history) feeding into a prediction of PAC at 5 seconds ahead. Raw PAC targets, no smoothing, for realism.</w:t>
+        <w:t>Sequence</w:t>
+      </w:r>
+      <w:r>
+        <w:t xml:space="preserve"> setup: 20 timesteps of lookback (20 seconds of history) feeding into a prediction of PAC at 5 seconds ahead. Raw PAC targets, no smoothing, for realism.</w:t>
       </w:r>
     </w:p>
     <w:p>
@@ -2511,15 +2271,10 @@
         <w:ind w:left="-5" w:right="0"/>
       </w:pPr>
       <w:r>
-        <w:t xml:space="preserve">The second part of the day was building the model itself. I designed a </w:t>
-      </w:r>
-      <w:proofErr w:type="spellStart"/>
-      <w:r>
-        <w:t>MultiscaleCausalTCN</w:t>
-      </w:r>
-      <w:proofErr w:type="spellEnd"/>
-      <w:r>
-        <w:t xml:space="preserve"> with four temporal convolution blocks at increasing dilations:</w:t>
+        <w:t>Part 2: build it.</w:t>
+      </w:r>
+      <w:r>
+        <w:t xml:space="preserve"> I designed a MultiscaleCausalTCN with four temporal convolution blocks at increasing dilations:</w:t>
       </w:r>
     </w:p>
     <w:p>
@@ -2528,55 +2283,18 @@
         <w:spacing w:after="0" w:line="259" w:lineRule="auto"/>
         <w:ind w:left="235" w:right="127"/>
         <w:jc w:val="left"/>
-      </w:pPr>
-      <w:r>
         <w:rPr>
           <w:rFonts w:ascii="Courier New" w:eastAsia="Courier New" w:hAnsi="Courier New" w:cs="Courier New"/>
           <w:sz w:val="18"/>
         </w:rPr>
-        <w:t xml:space="preserve">dilations = [1, 2, 4, 8] # Each block: causal padding + </w:t>
-      </w:r>
-      <w:proofErr w:type="spellStart"/>
+      </w:pPr>
       <w:r>
         <w:rPr>
           <w:rFonts w:ascii="Courier New" w:eastAsia="Courier New" w:hAnsi="Courier New" w:cs="Courier New"/>
           <w:sz w:val="18"/>
         </w:rPr>
-        <w:t>depthwise</w:t>
-      </w:r>
-      <w:proofErr w:type="spellEnd"/>
-      <w:r>
-        <w:rPr>
-          <w:rFonts w:ascii="Courier New" w:eastAsia="Courier New" w:hAnsi="Courier New" w:cs="Courier New"/>
-          <w:sz w:val="18"/>
-        </w:rPr>
-        <w:t xml:space="preserve"> conv + pointwise conv + </w:t>
-      </w:r>
-      <w:proofErr w:type="spellStart"/>
-      <w:r>
-        <w:rPr>
-          <w:rFonts w:ascii="Courier New" w:eastAsia="Courier New" w:hAnsi="Courier New" w:cs="Courier New"/>
-          <w:sz w:val="18"/>
-        </w:rPr>
-        <w:t>GroupNorm</w:t>
-      </w:r>
-      <w:proofErr w:type="spellEnd"/>
-      <w:r>
-        <w:rPr>
-          <w:rFonts w:ascii="Courier New" w:eastAsia="Courier New" w:hAnsi="Courier New" w:cs="Courier New"/>
-          <w:sz w:val="18"/>
-        </w:rPr>
-        <w:t xml:space="preserve"> + </w:t>
-      </w:r>
-      <w:proofErr w:type="spellStart"/>
-      <w:r>
-        <w:rPr>
-          <w:rFonts w:ascii="Courier New" w:eastAsia="Courier New" w:hAnsi="Courier New" w:cs="Courier New"/>
-          <w:sz w:val="18"/>
-        </w:rPr>
-        <w:t>SiLU</w:t>
-      </w:r>
-      <w:proofErr w:type="spellEnd"/>
+        <w:t>dilations = [1, 2, 4, 8</w:t>
+      </w:r>
     </w:p>
     <w:p>
       <w:pPr>
@@ -2585,29 +2303,29 @@
         <w:ind w:left="235" w:right="127"/>
         <w:jc w:val="left"/>
       </w:pPr>
+      <w:proofErr w:type="gramStart"/>
       <w:r>
         <w:rPr>
           <w:rFonts w:ascii="Courier New" w:eastAsia="Courier New" w:hAnsi="Courier New" w:cs="Courier New"/>
           <w:sz w:val="18"/>
         </w:rPr>
-        <w:t xml:space="preserve">+ residual # Causal padding: </w:t>
-      </w:r>
-      <w:proofErr w:type="spellStart"/>
-      <w:proofErr w:type="gramStart"/>
+        <w:t>F.pad(</w:t>
+      </w:r>
+      <w:proofErr w:type="gramEnd"/>
       <w:r>
         <w:rPr>
           <w:rFonts w:ascii="Courier New" w:eastAsia="Courier New" w:hAnsi="Courier New" w:cs="Courier New"/>
           <w:sz w:val="18"/>
         </w:rPr>
-        <w:t>F.pad</w:t>
-      </w:r>
-      <w:proofErr w:type="spellEnd"/>
+        <w:t>x, ((kernel_size-</w:t>
+      </w:r>
+      <w:proofErr w:type="gramStart"/>
       <w:r>
         <w:rPr>
           <w:rFonts w:ascii="Courier New" w:eastAsia="Courier New" w:hAnsi="Courier New" w:cs="Courier New"/>
           <w:sz w:val="18"/>
         </w:rPr>
-        <w:t>(</w:t>
+        <w:t>1)*</w:t>
       </w:r>
       <w:proofErr w:type="gramEnd"/>
       <w:r>
@@ -2615,23 +2333,35 @@
           <w:rFonts w:ascii="Courier New" w:eastAsia="Courier New" w:hAnsi="Courier New" w:cs="Courier New"/>
           <w:sz w:val="18"/>
         </w:rPr>
-        <w:t>x, ((kernel_size-</w:t>
-      </w:r>
-      <w:proofErr w:type="gramStart"/>
+        <w:t>dilation, 0)) -</w:t>
+      </w:r>
       <w:r>
         <w:rPr>
           <w:rFonts w:ascii="Courier New" w:eastAsia="Courier New" w:hAnsi="Courier New" w:cs="Courier New"/>
           <w:sz w:val="18"/>
         </w:rPr>
-        <w:t>1)*</w:t>
-      </w:r>
-      <w:proofErr w:type="gramEnd"/>
+        <w:t>&gt;</w:t>
+      </w:r>
       <w:r>
         <w:rPr>
           <w:rFonts w:ascii="Courier New" w:eastAsia="Courier New" w:hAnsi="Courier New" w:cs="Courier New"/>
           <w:sz w:val="18"/>
         </w:rPr>
-        <w:t>dilation, 0)) -- left-only, no future leakage</w:t>
+        <w:t xml:space="preserve"> left-only, </w:t>
+      </w:r>
+      <w:r>
+        <w:rPr>
+          <w:rFonts w:ascii="Courier New" w:eastAsia="Courier New" w:hAnsi="Courier New" w:cs="Courier New"/>
+          <w:sz w:val="18"/>
+        </w:rPr>
+        <w:t xml:space="preserve">so </w:t>
+      </w:r>
+      <w:r>
+        <w:rPr>
+          <w:rFonts w:ascii="Courier New" w:eastAsia="Courier New" w:hAnsi="Courier New" w:cs="Courier New"/>
+          <w:sz w:val="18"/>
+        </w:rPr>
+        <w:t>no future leakage</w:t>
       </w:r>
     </w:p>
     <w:p>
@@ -2639,7 +2369,10 @@
         <w:ind w:left="-5" w:right="0"/>
       </w:pPr>
       <w:r>
-        <w:t>The receptive field calculation: kernel size 3, dilations [1, 2, 4, 8], RF = 1 + (3-1) x (1+2+4+8) = 31 timesteps. That covers the full 20-step input with margin. Output goes through learned attention pooling over the time dimension, then to a future PAC prediction head. Total parameters: 31,043.</w:t>
+        <w:t>RF calculation</w:t>
+      </w:r>
+      <w:r>
+        <w:t>: kernel size 3, dilations [1, 2, 4, 8], RF = 1 + (3-1) x (1+2+4+8) = 31 timesteps. That covers the full 20-step input with margin. Output goes through learned attention pooling over the time dimension, then to a future PAC prediction head. Total parameters: 31,043.</w:t>
       </w:r>
     </w:p>
     <w:p>
@@ -2647,7 +2380,7 @@
         <w:ind w:left="-5" w:right="0"/>
       </w:pPr>
       <w:r>
-        <w:t>Key design choices and why:</w:t>
+        <w:t>Choices:</w:t>
       </w:r>
     </w:p>
     <w:p>
@@ -2658,57 +2391,27 @@
         </w:numPr>
         <w:spacing w:after="0"/>
         <w:ind w:right="0" w:hanging="132"/>
-      </w:pPr>
-      <w:proofErr w:type="spellStart"/>
-      <w:r>
-        <w:rPr>
-          <w:b/>
-        </w:rPr>
-        <w:t>GroupNorm</w:t>
-      </w:r>
-      <w:proofErr w:type="spellEnd"/>
-      <w:r>
-        <w:rPr>
-          <w:b/>
-        </w:rPr>
-        <w:t xml:space="preserve"> instead of </w:t>
-      </w:r>
-      <w:proofErr w:type="spellStart"/>
-      <w:r>
-        <w:rPr>
-          <w:b/>
-        </w:rPr>
-        <w:t>BatchNorm</w:t>
-      </w:r>
-      <w:proofErr w:type="spellEnd"/>
-      <w:r>
-        <w:rPr>
-          <w:b/>
-        </w:rPr>
-        <w:t>:</w:t>
-      </w:r>
-      <w:r>
-        <w:t xml:space="preserve"> Different patients have different PAC </w:t>
-      </w:r>
-      <w:proofErr w:type="gramStart"/>
-      <w:r>
-        <w:t>baselines;</w:t>
-      </w:r>
-      <w:proofErr w:type="gramEnd"/>
-    </w:p>
-    <w:p>
-      <w:pPr>
-        <w:spacing w:after="75" w:line="259" w:lineRule="auto"/>
-        <w:ind w:left="124" w:right="0" w:firstLine="0"/>
-        <w:jc w:val="center"/>
-      </w:pPr>
-      <w:proofErr w:type="spellStart"/>
-      <w:r>
-        <w:t>GroupNorm</w:t>
-      </w:r>
-      <w:proofErr w:type="spellEnd"/>
-      <w:r>
-        <w:t xml:space="preserve"> normalizes per-sample rather than per-batch, which stabilizes cross-subject training.</w:t>
+        <w:rPr>
+          <w:bCs/>
+        </w:rPr>
+      </w:pPr>
+      <w:r>
+        <w:rPr>
+          <w:bCs/>
+        </w:rPr>
+        <w:t>GroupNorm instead of BatchNorm: Different patients have different PAC baselines;</w:t>
+      </w:r>
+      <w:r>
+        <w:rPr>
+          <w:bCs/>
+        </w:rPr>
+        <w:t xml:space="preserve"> </w:t>
+      </w:r>
+      <w:r>
+        <w:rPr>
+          <w:bCs/>
+        </w:rPr>
+        <w:t>GroupNorm normalizes per-sample rather than per-batch, which stabilizes cross-subject training.</w:t>
       </w:r>
     </w:p>
     <w:p>
@@ -2718,42 +2421,15 @@
           <w:numId w:val="1"/>
         </w:numPr>
         <w:ind w:right="0" w:hanging="132"/>
-      </w:pPr>
-      <w:proofErr w:type="spellStart"/>
-      <w:r>
-        <w:rPr>
-          <w:b/>
-        </w:rPr>
-        <w:t>Depthwise</w:t>
-      </w:r>
-      <w:proofErr w:type="spellEnd"/>
-      <w:r>
-        <w:rPr>
-          <w:b/>
-        </w:rPr>
-        <w:t xml:space="preserve"> separable convolutions:</w:t>
-      </w:r>
-      <w:r>
-        <w:t xml:space="preserve"> Parameter efficiency by factorizing spatial and channel mixing.</w:t>
-      </w:r>
-    </w:p>
-    <w:p>
-      <w:pPr>
-        <w:numPr>
-          <w:ilvl w:val="0"/>
-          <w:numId w:val="1"/>
-        </w:numPr>
-        <w:spacing w:after="72"/>
-        <w:ind w:right="0" w:hanging="132"/>
-      </w:pPr>
-      <w:r>
-        <w:rPr>
-          <w:b/>
-        </w:rPr>
-        <w:t>Huber loss instead of MSE:</w:t>
-      </w:r>
-      <w:r>
-        <w:t xml:space="preserve"> PAC has outliers; Huber transitions from quadratic to linear for large errors, preventing outlier-driven gradient spikes.</w:t>
+        <w:rPr>
+          <w:bCs/>
+        </w:rPr>
+      </w:pPr>
+      <w:r>
+        <w:rPr>
+          <w:bCs/>
+        </w:rPr>
+        <w:t>Depthwise separable convolutions: Parameter efficiency by factorizing spatial and channel mixing.</w:t>
       </w:r>
     </w:p>
     <w:p>
@@ -2764,39 +2440,15 @@
         </w:numPr>
         <w:spacing w:after="73"/>
         <w:ind w:right="0" w:hanging="132"/>
-      </w:pPr>
-      <w:proofErr w:type="spellStart"/>
-      <w:r>
-        <w:rPr>
-          <w:b/>
-        </w:rPr>
-        <w:t>AdamW</w:t>
-      </w:r>
-      <w:proofErr w:type="spellEnd"/>
-      <w:r>
-        <w:rPr>
-          <w:b/>
-        </w:rPr>
-        <w:t xml:space="preserve"> optimizer</w:t>
-      </w:r>
-      <w:r>
-        <w:t xml:space="preserve"> with </w:t>
-      </w:r>
-      <w:proofErr w:type="spellStart"/>
-      <w:r>
-        <w:t>lr</w:t>
-      </w:r>
-      <w:proofErr w:type="spellEnd"/>
-      <w:r>
-        <w:t xml:space="preserve">=0.001, </w:t>
-      </w:r>
-      <w:proofErr w:type="spellStart"/>
-      <w:r>
-        <w:t>weight_decay</w:t>
-      </w:r>
-      <w:proofErr w:type="spellEnd"/>
-      <w:r>
-        <w:t>=0.001.</w:t>
+        <w:rPr>
+          <w:bCs/>
+        </w:rPr>
+      </w:pPr>
+      <w:r>
+        <w:rPr>
+          <w:bCs/>
+        </w:rPr>
+        <w:t>AdamW with lr=0.001, weight_decay=0.001.</w:t>
       </w:r>
     </w:p>
     <w:p>
@@ -2807,15 +2459,890 @@
         </w:numPr>
         <w:spacing w:after="0"/>
         <w:ind w:right="0" w:hanging="132"/>
-      </w:pPr>
-      <w:r>
-        <w:rPr>
-          <w:b/>
-        </w:rPr>
-        <w:t>Early stopping:</w:t>
-      </w:r>
-      <w:r>
-        <w:t xml:space="preserve"> patience=20, monitoring validation R².</w:t>
+        <w:rPr>
+          <w:bCs/>
+        </w:rPr>
+      </w:pPr>
+      <w:r>
+        <w:rPr>
+          <w:bCs/>
+        </w:rPr>
+        <w:t>Early stopping: patience=20, monitoring validation R².</w:t>
+      </w:r>
+    </w:p>
+    <w:tbl>
+      <w:tblPr>
+        <w:tblStyle w:val="TableGrid"/>
+        <w:tblW w:w="8685" w:type="dxa"/>
+        <w:tblInd w:w="-120" w:type="dxa"/>
+        <w:tblCellMar>
+          <w:top w:w="128" w:type="dxa"/>
+          <w:left w:w="120" w:type="dxa"/>
+          <w:right w:w="115" w:type="dxa"/>
+        </w:tblCellMar>
+        <w:tblLook w:val="04A0" w:firstRow="1" w:lastRow="0" w:firstColumn="1" w:lastColumn="0" w:noHBand="0" w:noVBand="1"/>
+      </w:tblPr>
+      <w:tblGrid>
+        <w:gridCol w:w="2895"/>
+        <w:gridCol w:w="2895"/>
+        <w:gridCol w:w="2895"/>
+      </w:tblGrid>
+      <w:tr>
+        <w:trPr>
+          <w:trHeight w:val="266"/>
+        </w:trPr>
+        <w:tc>
+          <w:tcPr>
+            <w:tcW w:w="2895" w:type="dxa"/>
+            <w:tcBorders>
+              <w:top w:val="single" w:sz="4" w:space="0" w:color="999999"/>
+              <w:left w:val="single" w:sz="4" w:space="0" w:color="999999"/>
+              <w:bottom w:val="single" w:sz="4" w:space="0" w:color="999999"/>
+              <w:right w:val="single" w:sz="4" w:space="0" w:color="999999"/>
+            </w:tcBorders>
+            <w:shd w:val="clear" w:color="auto" w:fill="2C5F8A"/>
+          </w:tcPr>
+          <w:p>
+            <w:pPr>
+              <w:spacing w:after="0" w:line="259" w:lineRule="auto"/>
+              <w:ind w:left="0" w:right="5" w:firstLine="0"/>
+              <w:jc w:val="center"/>
+            </w:pPr>
+            <w:r>
+              <w:rPr>
+                <w:b/>
+                <w:color w:val="FFFFFF"/>
+                <w:sz w:val="19"/>
+              </w:rPr>
+              <w:t>Component</w:t>
+            </w:r>
+          </w:p>
+        </w:tc>
+        <w:tc>
+          <w:tcPr>
+            <w:tcW w:w="2895" w:type="dxa"/>
+            <w:tcBorders>
+              <w:top w:val="single" w:sz="4" w:space="0" w:color="999999"/>
+              <w:left w:val="single" w:sz="4" w:space="0" w:color="999999"/>
+              <w:bottom w:val="single" w:sz="4" w:space="0" w:color="999999"/>
+              <w:right w:val="single" w:sz="4" w:space="0" w:color="999999"/>
+            </w:tcBorders>
+            <w:shd w:val="clear" w:color="auto" w:fill="2C5F8A"/>
+          </w:tcPr>
+          <w:p>
+            <w:pPr>
+              <w:spacing w:after="0" w:line="259" w:lineRule="auto"/>
+              <w:ind w:left="0" w:right="5" w:firstLine="0"/>
+              <w:jc w:val="center"/>
+            </w:pPr>
+            <w:r>
+              <w:rPr>
+                <w:b/>
+                <w:color w:val="FFFFFF"/>
+                <w:sz w:val="19"/>
+              </w:rPr>
+              <w:t>EEGNet</w:t>
+            </w:r>
+          </w:p>
+        </w:tc>
+        <w:tc>
+          <w:tcPr>
+            <w:tcW w:w="2895" w:type="dxa"/>
+            <w:tcBorders>
+              <w:top w:val="single" w:sz="4" w:space="0" w:color="999999"/>
+              <w:left w:val="single" w:sz="4" w:space="0" w:color="999999"/>
+              <w:bottom w:val="single" w:sz="4" w:space="0" w:color="999999"/>
+              <w:right w:val="single" w:sz="4" w:space="0" w:color="999999"/>
+            </w:tcBorders>
+            <w:shd w:val="clear" w:color="auto" w:fill="2C5F8A"/>
+          </w:tcPr>
+          <w:p>
+            <w:pPr>
+              <w:spacing w:after="0" w:line="259" w:lineRule="auto"/>
+              <w:ind w:left="0" w:right="5" w:firstLine="0"/>
+              <w:jc w:val="center"/>
+            </w:pPr>
+            <w:r>
+              <w:rPr>
+                <w:b/>
+                <w:color w:val="FFFFFF"/>
+                <w:sz w:val="19"/>
+              </w:rPr>
+              <w:t>Causal TCN</w:t>
+            </w:r>
+          </w:p>
+        </w:tc>
+      </w:tr>
+      <w:tr>
+        <w:trPr>
+          <w:trHeight w:val="266"/>
+        </w:trPr>
+        <w:tc>
+          <w:tcPr>
+            <w:tcW w:w="2895" w:type="dxa"/>
+            <w:tcBorders>
+              <w:top w:val="single" w:sz="4" w:space="0" w:color="999999"/>
+              <w:left w:val="single" w:sz="4" w:space="0" w:color="999999"/>
+              <w:bottom w:val="single" w:sz="4" w:space="0" w:color="999999"/>
+              <w:right w:val="single" w:sz="4" w:space="0" w:color="999999"/>
+            </w:tcBorders>
+          </w:tcPr>
+          <w:p>
+            <w:pPr>
+              <w:spacing w:after="0" w:line="259" w:lineRule="auto"/>
+              <w:ind w:left="0" w:right="0" w:firstLine="0"/>
+              <w:jc w:val="left"/>
+            </w:pPr>
+            <w:r>
+              <w:rPr>
+                <w:sz w:val="19"/>
+              </w:rPr>
+              <w:t>Purpose</w:t>
+            </w:r>
+          </w:p>
+        </w:tc>
+        <w:tc>
+          <w:tcPr>
+            <w:tcW w:w="2895" w:type="dxa"/>
+            <w:tcBorders>
+              <w:top w:val="single" w:sz="4" w:space="0" w:color="999999"/>
+              <w:left w:val="single" w:sz="4" w:space="0" w:color="999999"/>
+              <w:bottom w:val="single" w:sz="4" w:space="0" w:color="999999"/>
+              <w:right w:val="single" w:sz="4" w:space="0" w:color="999999"/>
+            </w:tcBorders>
+          </w:tcPr>
+          <w:p>
+            <w:pPr>
+              <w:spacing w:after="0" w:line="259" w:lineRule="auto"/>
+              <w:ind w:left="0" w:right="0" w:firstLine="0"/>
+              <w:jc w:val="left"/>
+            </w:pPr>
+            <w:r>
+              <w:rPr>
+                <w:sz w:val="19"/>
+              </w:rPr>
+              <w:t>Estimate current PAC from raw EEG</w:t>
+            </w:r>
+          </w:p>
+        </w:tc>
+        <w:tc>
+          <w:tcPr>
+            <w:tcW w:w="2895" w:type="dxa"/>
+            <w:tcBorders>
+              <w:top w:val="single" w:sz="4" w:space="0" w:color="999999"/>
+              <w:left w:val="single" w:sz="4" w:space="0" w:color="999999"/>
+              <w:bottom w:val="single" w:sz="4" w:space="0" w:color="999999"/>
+              <w:right w:val="single" w:sz="4" w:space="0" w:color="999999"/>
+            </w:tcBorders>
+          </w:tcPr>
+          <w:p>
+            <w:pPr>
+              <w:spacing w:after="0" w:line="259" w:lineRule="auto"/>
+              <w:ind w:left="0" w:right="0" w:firstLine="0"/>
+              <w:jc w:val="left"/>
+            </w:pPr>
+            <w:r>
+              <w:rPr>
+                <w:sz w:val="19"/>
+              </w:rPr>
+              <w:t>Predict future PAC from history</w:t>
+            </w:r>
+          </w:p>
+        </w:tc>
+      </w:tr>
+      <w:tr>
+        <w:trPr>
+          <w:trHeight w:val="266"/>
+        </w:trPr>
+        <w:tc>
+          <w:tcPr>
+            <w:tcW w:w="2895" w:type="dxa"/>
+            <w:tcBorders>
+              <w:top w:val="single" w:sz="4" w:space="0" w:color="999999"/>
+              <w:left w:val="single" w:sz="4" w:space="0" w:color="999999"/>
+              <w:bottom w:val="single" w:sz="4" w:space="0" w:color="999999"/>
+              <w:right w:val="single" w:sz="4" w:space="0" w:color="999999"/>
+            </w:tcBorders>
+            <w:shd w:val="clear" w:color="auto" w:fill="EAF2F8"/>
+          </w:tcPr>
+          <w:p>
+            <w:pPr>
+              <w:spacing w:after="0" w:line="259" w:lineRule="auto"/>
+              <w:ind w:left="0" w:right="0" w:firstLine="0"/>
+              <w:jc w:val="left"/>
+            </w:pPr>
+            <w:r>
+              <w:rPr>
+                <w:sz w:val="19"/>
+              </w:rPr>
+              <w:t>Parameters</w:t>
+            </w:r>
+          </w:p>
+        </w:tc>
+        <w:tc>
+          <w:tcPr>
+            <w:tcW w:w="2895" w:type="dxa"/>
+            <w:tcBorders>
+              <w:top w:val="single" w:sz="4" w:space="0" w:color="999999"/>
+              <w:left w:val="single" w:sz="4" w:space="0" w:color="999999"/>
+              <w:bottom w:val="single" w:sz="4" w:space="0" w:color="999999"/>
+              <w:right w:val="single" w:sz="4" w:space="0" w:color="999999"/>
+            </w:tcBorders>
+            <w:shd w:val="clear" w:color="auto" w:fill="EAF2F8"/>
+          </w:tcPr>
+          <w:p>
+            <w:pPr>
+              <w:spacing w:after="0" w:line="259" w:lineRule="auto"/>
+              <w:ind w:left="0" w:right="0" w:firstLine="0"/>
+              <w:jc w:val="left"/>
+            </w:pPr>
+            <w:r>
+              <w:rPr>
+                <w:sz w:val="19"/>
+              </w:rPr>
+              <w:t>1,457</w:t>
+            </w:r>
+          </w:p>
+        </w:tc>
+        <w:tc>
+          <w:tcPr>
+            <w:tcW w:w="2895" w:type="dxa"/>
+            <w:tcBorders>
+              <w:top w:val="single" w:sz="4" w:space="0" w:color="999999"/>
+              <w:left w:val="single" w:sz="4" w:space="0" w:color="999999"/>
+              <w:bottom w:val="single" w:sz="4" w:space="0" w:color="999999"/>
+              <w:right w:val="single" w:sz="4" w:space="0" w:color="999999"/>
+            </w:tcBorders>
+            <w:shd w:val="clear" w:color="auto" w:fill="EAF2F8"/>
+          </w:tcPr>
+          <w:p>
+            <w:pPr>
+              <w:spacing w:after="0" w:line="259" w:lineRule="auto"/>
+              <w:ind w:left="0" w:right="0" w:firstLine="0"/>
+              <w:jc w:val="left"/>
+            </w:pPr>
+            <w:r>
+              <w:rPr>
+                <w:sz w:val="19"/>
+              </w:rPr>
+              <w:t>31,043</w:t>
+            </w:r>
+          </w:p>
+        </w:tc>
+      </w:tr>
+      <w:tr>
+        <w:trPr>
+          <w:trHeight w:val="266"/>
+        </w:trPr>
+        <w:tc>
+          <w:tcPr>
+            <w:tcW w:w="2895" w:type="dxa"/>
+            <w:tcBorders>
+              <w:top w:val="single" w:sz="4" w:space="0" w:color="999999"/>
+              <w:left w:val="single" w:sz="4" w:space="0" w:color="999999"/>
+              <w:bottom w:val="single" w:sz="4" w:space="0" w:color="999999"/>
+              <w:right w:val="single" w:sz="4" w:space="0" w:color="999999"/>
+            </w:tcBorders>
+          </w:tcPr>
+          <w:p>
+            <w:pPr>
+              <w:spacing w:after="0" w:line="259" w:lineRule="auto"/>
+              <w:ind w:left="0" w:right="0" w:firstLine="0"/>
+              <w:jc w:val="left"/>
+            </w:pPr>
+            <w:r>
+              <w:rPr>
+                <w:sz w:val="19"/>
+              </w:rPr>
+              <w:t>Input</w:t>
+            </w:r>
+          </w:p>
+        </w:tc>
+        <w:tc>
+          <w:tcPr>
+            <w:tcW w:w="2895" w:type="dxa"/>
+            <w:tcBorders>
+              <w:top w:val="single" w:sz="4" w:space="0" w:color="999999"/>
+              <w:left w:val="single" w:sz="4" w:space="0" w:color="999999"/>
+              <w:bottom w:val="single" w:sz="4" w:space="0" w:color="999999"/>
+              <w:right w:val="single" w:sz="4" w:space="0" w:color="999999"/>
+            </w:tcBorders>
+          </w:tcPr>
+          <w:p>
+            <w:pPr>
+              <w:spacing w:after="0" w:line="259" w:lineRule="auto"/>
+              <w:ind w:left="0" w:right="0" w:firstLine="0"/>
+              <w:jc w:val="left"/>
+            </w:pPr>
+            <w:r>
+              <w:rPr>
+                <w:sz w:val="19"/>
+              </w:rPr>
+              <w:t>Raw EEG (7 ch x 500 samples)</w:t>
+            </w:r>
+          </w:p>
+        </w:tc>
+        <w:tc>
+          <w:tcPr>
+            <w:tcW w:w="2895" w:type="dxa"/>
+            <w:tcBorders>
+              <w:top w:val="single" w:sz="4" w:space="0" w:color="999999"/>
+              <w:left w:val="single" w:sz="4" w:space="0" w:color="999999"/>
+              <w:bottom w:val="single" w:sz="4" w:space="0" w:color="999999"/>
+              <w:right w:val="single" w:sz="4" w:space="0" w:color="999999"/>
+            </w:tcBorders>
+          </w:tcPr>
+          <w:p>
+            <w:pPr>
+              <w:spacing w:after="0" w:line="259" w:lineRule="auto"/>
+              <w:ind w:left="0" w:right="0" w:firstLine="0"/>
+              <w:jc w:val="left"/>
+            </w:pPr>
+            <w:r>
+              <w:rPr>
+                <w:sz w:val="19"/>
+              </w:rPr>
+              <w:t>73 features x 20 timesteps</w:t>
+            </w:r>
+          </w:p>
+        </w:tc>
+      </w:tr>
+      <w:tr>
+        <w:trPr>
+          <w:trHeight w:val="266"/>
+        </w:trPr>
+        <w:tc>
+          <w:tcPr>
+            <w:tcW w:w="2895" w:type="dxa"/>
+            <w:tcBorders>
+              <w:top w:val="single" w:sz="4" w:space="0" w:color="999999"/>
+              <w:left w:val="single" w:sz="4" w:space="0" w:color="999999"/>
+              <w:bottom w:val="single" w:sz="4" w:space="0" w:color="999999"/>
+              <w:right w:val="single" w:sz="4" w:space="0" w:color="999999"/>
+            </w:tcBorders>
+            <w:shd w:val="clear" w:color="auto" w:fill="EAF2F8"/>
+          </w:tcPr>
+          <w:p>
+            <w:pPr>
+              <w:spacing w:after="0" w:line="259" w:lineRule="auto"/>
+              <w:ind w:left="0" w:right="0" w:firstLine="0"/>
+              <w:jc w:val="left"/>
+            </w:pPr>
+            <w:r>
+              <w:rPr>
+                <w:sz w:val="19"/>
+              </w:rPr>
+              <w:t>Architecture</w:t>
+            </w:r>
+          </w:p>
+        </w:tc>
+        <w:tc>
+          <w:tcPr>
+            <w:tcW w:w="2895" w:type="dxa"/>
+            <w:tcBorders>
+              <w:top w:val="single" w:sz="4" w:space="0" w:color="999999"/>
+              <w:left w:val="single" w:sz="4" w:space="0" w:color="999999"/>
+              <w:bottom w:val="single" w:sz="4" w:space="0" w:color="999999"/>
+              <w:right w:val="single" w:sz="4" w:space="0" w:color="999999"/>
+            </w:tcBorders>
+            <w:shd w:val="clear" w:color="auto" w:fill="EAF2F8"/>
+          </w:tcPr>
+          <w:p>
+            <w:pPr>
+              <w:spacing w:after="0" w:line="259" w:lineRule="auto"/>
+              <w:ind w:left="0" w:right="0" w:firstLine="0"/>
+              <w:jc w:val="left"/>
+            </w:pPr>
+            <w:r>
+              <w:rPr>
+                <w:sz w:val="19"/>
+              </w:rPr>
+              <w:t>Temporal + depthwise spatial conv</w:t>
+            </w:r>
+          </w:p>
+        </w:tc>
+        <w:tc>
+          <w:tcPr>
+            <w:tcW w:w="2895" w:type="dxa"/>
+            <w:tcBorders>
+              <w:top w:val="single" w:sz="4" w:space="0" w:color="999999"/>
+              <w:left w:val="single" w:sz="4" w:space="0" w:color="999999"/>
+              <w:bottom w:val="single" w:sz="4" w:space="0" w:color="999999"/>
+              <w:right w:val="single" w:sz="4" w:space="0" w:color="999999"/>
+            </w:tcBorders>
+            <w:shd w:val="clear" w:color="auto" w:fill="EAF2F8"/>
+          </w:tcPr>
+          <w:p>
+            <w:pPr>
+              <w:spacing w:after="0" w:line="259" w:lineRule="auto"/>
+              <w:ind w:left="0" w:right="0" w:firstLine="0"/>
+              <w:jc w:val="left"/>
+            </w:pPr>
+            <w:r>
+              <w:rPr>
+                <w:sz w:val="19"/>
+              </w:rPr>
+              <w:t>Dilated causal conv (d=1,2,4,8)</w:t>
+            </w:r>
+          </w:p>
+        </w:tc>
+      </w:tr>
+      <w:tr>
+        <w:trPr>
+          <w:trHeight w:val="266"/>
+        </w:trPr>
+        <w:tc>
+          <w:tcPr>
+            <w:tcW w:w="2895" w:type="dxa"/>
+            <w:tcBorders>
+              <w:top w:val="single" w:sz="4" w:space="0" w:color="999999"/>
+              <w:left w:val="single" w:sz="4" w:space="0" w:color="999999"/>
+              <w:bottom w:val="single" w:sz="4" w:space="0" w:color="999999"/>
+              <w:right w:val="single" w:sz="4" w:space="0" w:color="999999"/>
+            </w:tcBorders>
+          </w:tcPr>
+          <w:p>
+            <w:pPr>
+              <w:spacing w:after="0" w:line="259" w:lineRule="auto"/>
+              <w:ind w:left="0" w:right="0" w:firstLine="0"/>
+              <w:jc w:val="left"/>
+            </w:pPr>
+            <w:r>
+              <w:rPr>
+                <w:sz w:val="19"/>
+              </w:rPr>
+              <w:t>Output</w:t>
+            </w:r>
+          </w:p>
+        </w:tc>
+        <w:tc>
+          <w:tcPr>
+            <w:tcW w:w="2895" w:type="dxa"/>
+            <w:tcBorders>
+              <w:top w:val="single" w:sz="4" w:space="0" w:color="999999"/>
+              <w:left w:val="single" w:sz="4" w:space="0" w:color="999999"/>
+              <w:bottom w:val="single" w:sz="4" w:space="0" w:color="999999"/>
+              <w:right w:val="single" w:sz="4" w:space="0" w:color="999999"/>
+            </w:tcBorders>
+          </w:tcPr>
+          <w:p>
+            <w:pPr>
+              <w:spacing w:after="0" w:line="259" w:lineRule="auto"/>
+              <w:ind w:left="0" w:right="0" w:firstLine="0"/>
+              <w:jc w:val="left"/>
+            </w:pPr>
+            <w:r>
+              <w:rPr>
+                <w:sz w:val="19"/>
+              </w:rPr>
+              <w:t>Current PAC estimate</w:t>
+            </w:r>
+          </w:p>
+        </w:tc>
+        <w:tc>
+          <w:tcPr>
+            <w:tcW w:w="2895" w:type="dxa"/>
+            <w:tcBorders>
+              <w:top w:val="single" w:sz="4" w:space="0" w:color="999999"/>
+              <w:left w:val="single" w:sz="4" w:space="0" w:color="999999"/>
+              <w:bottom w:val="single" w:sz="4" w:space="0" w:color="999999"/>
+              <w:right w:val="single" w:sz="4" w:space="0" w:color="999999"/>
+            </w:tcBorders>
+          </w:tcPr>
+          <w:p>
+            <w:pPr>
+              <w:spacing w:after="0" w:line="259" w:lineRule="auto"/>
+              <w:ind w:left="0" w:right="0" w:firstLine="0"/>
+              <w:jc w:val="left"/>
+            </w:pPr>
+            <w:r>
+              <w:rPr>
+                <w:sz w:val="19"/>
+              </w:rPr>
+              <w:t>Future PAC (5s horizon)</w:t>
+            </w:r>
+          </w:p>
+        </w:tc>
+      </w:tr>
+      <w:tr>
+        <w:trPr>
+          <w:trHeight w:val="266"/>
+        </w:trPr>
+        <w:tc>
+          <w:tcPr>
+            <w:tcW w:w="2895" w:type="dxa"/>
+            <w:tcBorders>
+              <w:top w:val="single" w:sz="4" w:space="0" w:color="999999"/>
+              <w:left w:val="single" w:sz="4" w:space="0" w:color="999999"/>
+              <w:bottom w:val="single" w:sz="4" w:space="0" w:color="999999"/>
+              <w:right w:val="single" w:sz="4" w:space="0" w:color="999999"/>
+            </w:tcBorders>
+            <w:shd w:val="clear" w:color="auto" w:fill="EAF2F8"/>
+          </w:tcPr>
+          <w:p>
+            <w:pPr>
+              <w:spacing w:after="0" w:line="259" w:lineRule="auto"/>
+              <w:ind w:left="0" w:right="0" w:firstLine="0"/>
+              <w:jc w:val="left"/>
+            </w:pPr>
+            <w:r>
+              <w:rPr>
+                <w:sz w:val="19"/>
+              </w:rPr>
+              <w:t>Key feature</w:t>
+            </w:r>
+          </w:p>
+        </w:tc>
+        <w:tc>
+          <w:tcPr>
+            <w:tcW w:w="2895" w:type="dxa"/>
+            <w:tcBorders>
+              <w:top w:val="single" w:sz="4" w:space="0" w:color="999999"/>
+              <w:left w:val="single" w:sz="4" w:space="0" w:color="999999"/>
+              <w:bottom w:val="single" w:sz="4" w:space="0" w:color="999999"/>
+              <w:right w:val="single" w:sz="4" w:space="0" w:color="999999"/>
+            </w:tcBorders>
+            <w:shd w:val="clear" w:color="auto" w:fill="EAF2F8"/>
+          </w:tcPr>
+          <w:p>
+            <w:pPr>
+              <w:spacing w:after="0" w:line="259" w:lineRule="auto"/>
+              <w:ind w:left="0" w:right="0" w:firstLine="0"/>
+              <w:jc w:val="left"/>
+            </w:pPr>
+            <w:r>
+              <w:rPr>
+                <w:sz w:val="19"/>
+              </w:rPr>
+              <w:t>Real-time inference</w:t>
+            </w:r>
+          </w:p>
+        </w:tc>
+        <w:tc>
+          <w:tcPr>
+            <w:tcW w:w="2895" w:type="dxa"/>
+            <w:tcBorders>
+              <w:top w:val="single" w:sz="4" w:space="0" w:color="999999"/>
+              <w:left w:val="single" w:sz="4" w:space="0" w:color="999999"/>
+              <w:bottom w:val="single" w:sz="4" w:space="0" w:color="999999"/>
+              <w:right w:val="single" w:sz="4" w:space="0" w:color="999999"/>
+            </w:tcBorders>
+            <w:shd w:val="clear" w:color="auto" w:fill="EAF2F8"/>
+          </w:tcPr>
+          <w:p>
+            <w:pPr>
+              <w:spacing w:after="0" w:line="259" w:lineRule="auto"/>
+              <w:ind w:left="0" w:right="0" w:firstLine="0"/>
+              <w:jc w:val="left"/>
+            </w:pPr>
+            <w:r>
+              <w:rPr>
+                <w:sz w:val="19"/>
+              </w:rPr>
+              <w:t>31-step receptive field, causal</w:t>
+            </w:r>
+          </w:p>
+        </w:tc>
+      </w:tr>
+    </w:tbl>
+    <w:p>
+      <w:pPr>
+        <w:spacing w:after="812"/>
+        <w:ind w:left="-5" w:right="0"/>
+      </w:pPr>
+      <w:r>
+        <w:br/>
+      </w:r>
+      <w:r>
+        <w:t>First training result</w:t>
+      </w:r>
+      <w:r>
+        <w:t xml:space="preserve">s: </w:t>
+      </w:r>
+      <w:r>
+        <w:t xml:space="preserve">validation R² = 0.411 versus test R² = 0.170. </w:t>
+      </w:r>
+      <w:r>
+        <w:t xml:space="preserve">Probably because </w:t>
+      </w:r>
+      <w:r>
+        <w:t>PAC dynamics vary across patients. It also reinforced why personalized control matters.</w:t>
+      </w:r>
+      <w:r>
+        <w:rPr>
+          <w:color w:val="000000" w:themeColor="text1"/>
+        </w:rPr>
+        <w:br w:type="page"/>
+      </w:r>
+    </w:p>
+    <w:p>
+      <w:pPr>
+        <w:pStyle w:val="Heading1"/>
+        <w:ind w:left="-5"/>
+        <w:rPr>
+          <w:color w:val="000000" w:themeColor="text1"/>
+          <w:u w:val="none"/>
+        </w:rPr>
+      </w:pPr>
+      <w:r>
+        <w:rPr>
+          <w:color w:val="000000" w:themeColor="text1"/>
+          <w:u w:val="none"/>
+        </w:rPr>
+        <w:lastRenderedPageBreak/>
+        <w:t>February 18, 2026</w:t>
+      </w:r>
+    </w:p>
+    <w:p>
+      <w:pPr>
+        <w:ind w:left="-5" w:right="0"/>
+      </w:pPr>
+      <w:r>
+        <w:t xml:space="preserve">The temporal model could easily be </w:t>
+      </w:r>
+      <w:proofErr w:type="gramStart"/>
+      <w:r>
+        <w:t>over stated</w:t>
+      </w:r>
+      <w:proofErr w:type="gramEnd"/>
+      <w:r>
+        <w:t xml:space="preserve"> because</w:t>
+      </w:r>
+      <w:r>
+        <w:t xml:space="preserve"> </w:t>
+      </w:r>
+      <w:r>
+        <w:t>s</w:t>
+      </w:r>
+      <w:r>
+        <w:t>moothed targets make some metrics look much better than raw</w:t>
+      </w:r>
+      <w:r>
+        <w:t xml:space="preserve"> </w:t>
+      </w:r>
+      <w:r>
+        <w:t>target forecasting, and PAC</w:t>
+      </w:r>
+      <w:r>
+        <w:t xml:space="preserve"> </w:t>
+      </w:r>
+      <w:r>
+        <w:t xml:space="preserve">history features have obvious predictive </w:t>
+      </w:r>
+      <w:r>
+        <w:t>control.</w:t>
+      </w:r>
+    </w:p>
+    <w:p>
+      <w:pPr>
+        <w:ind w:left="-5" w:right="0"/>
+      </w:pPr>
+      <w:r>
+        <w:t xml:space="preserve">I documented assumptions, wrote out methodology choices, and checked the temporal pipeline for the failure modes that had already hurt the static phase: data leakage, split mistakes, and overly flattering interpretations. </w:t>
+      </w:r>
+    </w:p>
+    <w:p>
+      <w:pPr>
+        <w:ind w:left="-5" w:right="0"/>
+      </w:pPr>
+      <w:r>
+        <w:t>D</w:t>
+      </w:r>
+      <w:r>
+        <w:t>ata integrity checklist:</w:t>
+      </w:r>
+    </w:p>
+    <w:p>
+      <w:pPr>
+        <w:numPr>
+          <w:ilvl w:val="0"/>
+          <w:numId w:val="2"/>
+        </w:numPr>
+        <w:spacing w:after="73"/>
+        <w:ind w:right="0" w:hanging="132"/>
+        <w:rPr>
+          <w:bCs/>
+        </w:rPr>
+      </w:pPr>
+      <w:r>
+        <w:rPr>
+          <w:bCs/>
+        </w:rPr>
+        <w:t>No leakage: Verified training, validation, and test subjects completely distinct.</w:t>
+      </w:r>
+    </w:p>
+    <w:p>
+      <w:pPr>
+        <w:numPr>
+          <w:ilvl w:val="0"/>
+          <w:numId w:val="2"/>
+        </w:numPr>
+        <w:spacing w:after="73"/>
+        <w:ind w:right="0" w:hanging="132"/>
+        <w:rPr>
+          <w:bCs/>
+        </w:rPr>
+      </w:pPr>
+      <w:r>
+        <w:rPr>
+          <w:bCs/>
+        </w:rPr>
+        <w:t>All feature timestamps strictly precede target timestamps.</w:t>
+      </w:r>
+    </w:p>
+    <w:p>
+      <w:pPr>
+        <w:numPr>
+          <w:ilvl w:val="0"/>
+          <w:numId w:val="2"/>
+        </w:numPr>
+        <w:spacing w:after="73"/>
+        <w:ind w:right="0" w:hanging="132"/>
+        <w:rPr>
+          <w:bCs/>
+        </w:rPr>
+      </w:pPr>
+      <w:r>
+        <w:rPr>
+          <w:bCs/>
+        </w:rPr>
+        <w:t>Scalers fit only on training data, applied to all splits.</w:t>
+      </w:r>
+    </w:p>
+    <w:p>
+      <w:pPr>
+        <w:numPr>
+          <w:ilvl w:val="0"/>
+          <w:numId w:val="2"/>
+        </w:numPr>
+        <w:spacing w:after="72"/>
+        <w:ind w:right="0" w:hanging="132"/>
+        <w:rPr>
+          <w:bCs/>
+        </w:rPr>
+      </w:pPr>
+      <w:r>
+        <w:rPr>
+          <w:bCs/>
+        </w:rPr>
+        <w:t>No input features exceed r = 0.5 with target (after PAC leak removal from the SpecTempNet lesson).</w:t>
+      </w:r>
+    </w:p>
+    <w:p>
+      <w:pPr>
+        <w:numPr>
+          <w:ilvl w:val="0"/>
+          <w:numId w:val="2"/>
+        </w:numPr>
+        <w:spacing w:after="73"/>
+        <w:ind w:right="0" w:hanging="132"/>
+        <w:rPr>
+          <w:bCs/>
+        </w:rPr>
+      </w:pPr>
+      <w:r>
+        <w:rPr>
+          <w:bCs/>
+        </w:rPr>
+        <w:t>Shuffle-labe</w:t>
+      </w:r>
+      <w:r>
+        <w:rPr>
+          <w:bCs/>
+        </w:rPr>
+        <w:t>l -</w:t>
+      </w:r>
+      <w:r>
+        <w:rPr>
+          <w:bCs/>
+        </w:rPr>
+        <w:t xml:space="preserve"> R² = -0.332 on permuted labels, </w:t>
+      </w:r>
+      <w:r>
+        <w:rPr>
+          <w:bCs/>
+        </w:rPr>
+        <w:t>which is good</w:t>
+      </w:r>
+    </w:p>
+    <w:p>
+      <w:pPr>
+        <w:spacing w:after="152"/>
+        <w:ind w:left="-5" w:right="0"/>
+      </w:pPr>
+      <w:r>
+        <w:t>Checked</w:t>
+      </w:r>
+      <w:r>
+        <w:t xml:space="preserve"> the habituation patterns in the real EEG dat</w:t>
+      </w:r>
+      <w:r>
+        <w:t>a by looking at PAC history per patient:</w:t>
+      </w:r>
+    </w:p>
+    <w:p>
+      <w:pPr>
+        <w:shd w:val="clear" w:color="auto" w:fill="F0F0F0"/>
+        <w:spacing w:after="0" w:line="259" w:lineRule="auto"/>
+        <w:ind w:left="235" w:right="127"/>
+        <w:jc w:val="left"/>
+      </w:pPr>
+      <w:r>
+        <w:rPr>
+          <w:rFonts w:ascii="Courier New" w:eastAsia="Courier New" w:hAnsi="Courier New" w:cs="Courier New"/>
+          <w:sz w:val="18"/>
+        </w:rPr>
+        <w:t>First Block Mean PAC: 0.000996</w:t>
+      </w:r>
+    </w:p>
+    <w:p>
+      <w:pPr>
+        <w:shd w:val="clear" w:color="auto" w:fill="F0F0F0"/>
+        <w:spacing w:after="0" w:line="259" w:lineRule="auto"/>
+        <w:ind w:left="235" w:right="127"/>
+        <w:jc w:val="left"/>
+      </w:pPr>
+      <w:r>
+        <w:rPr>
+          <w:rFonts w:ascii="Courier New" w:eastAsia="Courier New" w:hAnsi="Courier New" w:cs="Courier New"/>
+          <w:sz w:val="18"/>
+        </w:rPr>
+        <w:t>Last Block Mean PAC: 0.001040</w:t>
+      </w:r>
+    </w:p>
+    <w:p>
+      <w:pPr>
+        <w:shd w:val="clear" w:color="auto" w:fill="F0F0F0"/>
+        <w:spacing w:after="240" w:line="259" w:lineRule="auto"/>
+        <w:ind w:left="235" w:right="127"/>
+        <w:jc w:val="left"/>
+      </w:pPr>
+      <w:r>
+        <w:rPr>
+          <w:rFonts w:ascii="Courier New" w:eastAsia="Courier New" w:hAnsi="Courier New" w:cs="Courier New"/>
+          <w:sz w:val="18"/>
+        </w:rPr>
+        <w:t>Population Change: +4.5% (not significant, p = 0.542)</w:t>
+      </w:r>
+    </w:p>
+    <w:p>
+      <w:pPr>
+        <w:ind w:left="-5" w:right="0"/>
+      </w:pPr>
+      <w:r>
+        <w:t>No population</w:t>
+      </w:r>
+      <w:r>
+        <w:t xml:space="preserve"> </w:t>
+      </w:r>
+      <w:r>
+        <w:t xml:space="preserve">trend but the individual variability </w:t>
+      </w:r>
+      <w:r>
+        <w:t>was the issue</w:t>
+      </w:r>
+      <w:r>
+        <w:t>:</w:t>
       </w:r>
     </w:p>
     <w:tbl>
@@ -2825,834 +3352,6 @@
         <w:tblInd w:w="-120" w:type="dxa"/>
         <w:tblCellMar>
           <w:top w:w="128" w:type="dxa"/>
-          <w:left w:w="120" w:type="dxa"/>
-          <w:bottom w:w="0" w:type="dxa"/>
-          <w:right w:w="115" w:type="dxa"/>
-        </w:tblCellMar>
-        <w:tblLook w:val="04A0" w:firstRow="1" w:lastRow="0" w:firstColumn="1" w:lastColumn="0" w:noHBand="0" w:noVBand="1"/>
-      </w:tblPr>
-      <w:tblGrid>
-        <w:gridCol w:w="3120"/>
-        <w:gridCol w:w="3120"/>
-        <w:gridCol w:w="3120"/>
-      </w:tblGrid>
-      <w:tr>
-        <w:trPr>
-          <w:trHeight w:val="400"/>
-        </w:trPr>
-        <w:tc>
-          <w:tcPr>
-            <w:tcW w:w="3120" w:type="dxa"/>
-            <w:tcBorders>
-              <w:top w:val="single" w:sz="4" w:space="0" w:color="999999"/>
-              <w:left w:val="single" w:sz="4" w:space="0" w:color="999999"/>
-              <w:bottom w:val="single" w:sz="4" w:space="0" w:color="999999"/>
-              <w:right w:val="single" w:sz="4" w:space="0" w:color="999999"/>
-            </w:tcBorders>
-            <w:shd w:val="clear" w:color="auto" w:fill="2C5F8A"/>
-          </w:tcPr>
-          <w:p>
-            <w:pPr>
-              <w:spacing w:after="0" w:line="259" w:lineRule="auto"/>
-              <w:ind w:left="0" w:right="5" w:firstLine="0"/>
-              <w:jc w:val="center"/>
-            </w:pPr>
-            <w:r>
-              <w:rPr>
-                <w:b/>
-                <w:color w:val="FFFFFF"/>
-                <w:sz w:val="19"/>
-              </w:rPr>
-              <w:t>Component</w:t>
-            </w:r>
-          </w:p>
-        </w:tc>
-        <w:tc>
-          <w:tcPr>
-            <w:tcW w:w="3120" w:type="dxa"/>
-            <w:tcBorders>
-              <w:top w:val="single" w:sz="4" w:space="0" w:color="999999"/>
-              <w:left w:val="single" w:sz="4" w:space="0" w:color="999999"/>
-              <w:bottom w:val="single" w:sz="4" w:space="0" w:color="999999"/>
-              <w:right w:val="single" w:sz="4" w:space="0" w:color="999999"/>
-            </w:tcBorders>
-            <w:shd w:val="clear" w:color="auto" w:fill="2C5F8A"/>
-          </w:tcPr>
-          <w:p>
-            <w:pPr>
-              <w:spacing w:after="0" w:line="259" w:lineRule="auto"/>
-              <w:ind w:left="0" w:right="5" w:firstLine="0"/>
-              <w:jc w:val="center"/>
-            </w:pPr>
-            <w:r>
-              <w:rPr>
-                <w:b/>
-                <w:color w:val="FFFFFF"/>
-                <w:sz w:val="19"/>
-              </w:rPr>
-              <w:t>EEGNet</w:t>
-            </w:r>
-          </w:p>
-        </w:tc>
-        <w:tc>
-          <w:tcPr>
-            <w:tcW w:w="3120" w:type="dxa"/>
-            <w:tcBorders>
-              <w:top w:val="single" w:sz="4" w:space="0" w:color="999999"/>
-              <w:left w:val="single" w:sz="4" w:space="0" w:color="999999"/>
-              <w:bottom w:val="single" w:sz="4" w:space="0" w:color="999999"/>
-              <w:right w:val="single" w:sz="4" w:space="0" w:color="999999"/>
-            </w:tcBorders>
-            <w:shd w:val="clear" w:color="auto" w:fill="2C5F8A"/>
-          </w:tcPr>
-          <w:p>
-            <w:pPr>
-              <w:spacing w:after="0" w:line="259" w:lineRule="auto"/>
-              <w:ind w:left="0" w:right="5" w:firstLine="0"/>
-              <w:jc w:val="center"/>
-            </w:pPr>
-            <w:r>
-              <w:rPr>
-                <w:b/>
-                <w:color w:val="FFFFFF"/>
-                <w:sz w:val="19"/>
-              </w:rPr>
-              <w:t>Causal TCN</w:t>
-            </w:r>
-          </w:p>
-        </w:tc>
-      </w:tr>
-      <w:tr>
-        <w:trPr>
-          <w:trHeight w:val="400"/>
-        </w:trPr>
-        <w:tc>
-          <w:tcPr>
-            <w:tcW w:w="3120" w:type="dxa"/>
-            <w:tcBorders>
-              <w:top w:val="single" w:sz="4" w:space="0" w:color="999999"/>
-              <w:left w:val="single" w:sz="4" w:space="0" w:color="999999"/>
-              <w:bottom w:val="single" w:sz="4" w:space="0" w:color="999999"/>
-              <w:right w:val="single" w:sz="4" w:space="0" w:color="999999"/>
-            </w:tcBorders>
-          </w:tcPr>
-          <w:p>
-            <w:pPr>
-              <w:spacing w:after="0" w:line="259" w:lineRule="auto"/>
-              <w:ind w:left="0" w:right="0" w:firstLine="0"/>
-              <w:jc w:val="left"/>
-            </w:pPr>
-            <w:r>
-              <w:rPr>
-                <w:sz w:val="19"/>
-              </w:rPr>
-              <w:t>Purpose</w:t>
-            </w:r>
-          </w:p>
-        </w:tc>
-        <w:tc>
-          <w:tcPr>
-            <w:tcW w:w="3120" w:type="dxa"/>
-            <w:tcBorders>
-              <w:top w:val="single" w:sz="4" w:space="0" w:color="999999"/>
-              <w:left w:val="single" w:sz="4" w:space="0" w:color="999999"/>
-              <w:bottom w:val="single" w:sz="4" w:space="0" w:color="999999"/>
-              <w:right w:val="single" w:sz="4" w:space="0" w:color="999999"/>
-            </w:tcBorders>
-          </w:tcPr>
-          <w:p>
-            <w:pPr>
-              <w:spacing w:after="0" w:line="259" w:lineRule="auto"/>
-              <w:ind w:left="0" w:right="0" w:firstLine="0"/>
-              <w:jc w:val="left"/>
-            </w:pPr>
-            <w:r>
-              <w:rPr>
-                <w:sz w:val="19"/>
-              </w:rPr>
-              <w:t>Estimate current PAC from raw EEG</w:t>
-            </w:r>
-          </w:p>
-        </w:tc>
-        <w:tc>
-          <w:tcPr>
-            <w:tcW w:w="3120" w:type="dxa"/>
-            <w:tcBorders>
-              <w:top w:val="single" w:sz="4" w:space="0" w:color="999999"/>
-              <w:left w:val="single" w:sz="4" w:space="0" w:color="999999"/>
-              <w:bottom w:val="single" w:sz="4" w:space="0" w:color="999999"/>
-              <w:right w:val="single" w:sz="4" w:space="0" w:color="999999"/>
-            </w:tcBorders>
-          </w:tcPr>
-          <w:p>
-            <w:pPr>
-              <w:spacing w:after="0" w:line="259" w:lineRule="auto"/>
-              <w:ind w:left="0" w:right="0" w:firstLine="0"/>
-              <w:jc w:val="left"/>
-            </w:pPr>
-            <w:r>
-              <w:rPr>
-                <w:sz w:val="19"/>
-              </w:rPr>
-              <w:t>Predict future PAC from history</w:t>
-            </w:r>
-          </w:p>
-        </w:tc>
-      </w:tr>
-      <w:tr>
-        <w:trPr>
-          <w:trHeight w:val="400"/>
-        </w:trPr>
-        <w:tc>
-          <w:tcPr>
-            <w:tcW w:w="3120" w:type="dxa"/>
-            <w:tcBorders>
-              <w:top w:val="single" w:sz="4" w:space="0" w:color="999999"/>
-              <w:left w:val="single" w:sz="4" w:space="0" w:color="999999"/>
-              <w:bottom w:val="single" w:sz="4" w:space="0" w:color="999999"/>
-              <w:right w:val="single" w:sz="4" w:space="0" w:color="999999"/>
-            </w:tcBorders>
-            <w:shd w:val="clear" w:color="auto" w:fill="EAF2F8"/>
-          </w:tcPr>
-          <w:p>
-            <w:pPr>
-              <w:spacing w:after="0" w:line="259" w:lineRule="auto"/>
-              <w:ind w:left="0" w:right="0" w:firstLine="0"/>
-              <w:jc w:val="left"/>
-            </w:pPr>
-            <w:r>
-              <w:rPr>
-                <w:sz w:val="19"/>
-              </w:rPr>
-              <w:lastRenderedPageBreak/>
-              <w:t>Parameters</w:t>
-            </w:r>
-          </w:p>
-        </w:tc>
-        <w:tc>
-          <w:tcPr>
-            <w:tcW w:w="3120" w:type="dxa"/>
-            <w:tcBorders>
-              <w:top w:val="single" w:sz="4" w:space="0" w:color="999999"/>
-              <w:left w:val="single" w:sz="4" w:space="0" w:color="999999"/>
-              <w:bottom w:val="single" w:sz="4" w:space="0" w:color="999999"/>
-              <w:right w:val="single" w:sz="4" w:space="0" w:color="999999"/>
-            </w:tcBorders>
-            <w:shd w:val="clear" w:color="auto" w:fill="EAF2F8"/>
-          </w:tcPr>
-          <w:p>
-            <w:pPr>
-              <w:spacing w:after="0" w:line="259" w:lineRule="auto"/>
-              <w:ind w:left="0" w:right="0" w:firstLine="0"/>
-              <w:jc w:val="left"/>
-            </w:pPr>
-            <w:r>
-              <w:rPr>
-                <w:sz w:val="19"/>
-              </w:rPr>
-              <w:t>1,457</w:t>
-            </w:r>
-          </w:p>
-        </w:tc>
-        <w:tc>
-          <w:tcPr>
-            <w:tcW w:w="3120" w:type="dxa"/>
-            <w:tcBorders>
-              <w:top w:val="single" w:sz="4" w:space="0" w:color="999999"/>
-              <w:left w:val="single" w:sz="4" w:space="0" w:color="999999"/>
-              <w:bottom w:val="single" w:sz="4" w:space="0" w:color="999999"/>
-              <w:right w:val="single" w:sz="4" w:space="0" w:color="999999"/>
-            </w:tcBorders>
-            <w:shd w:val="clear" w:color="auto" w:fill="EAF2F8"/>
-          </w:tcPr>
-          <w:p>
-            <w:pPr>
-              <w:spacing w:after="0" w:line="259" w:lineRule="auto"/>
-              <w:ind w:left="0" w:right="0" w:firstLine="0"/>
-              <w:jc w:val="left"/>
-            </w:pPr>
-            <w:r>
-              <w:rPr>
-                <w:sz w:val="19"/>
-              </w:rPr>
-              <w:t>31,043</w:t>
-            </w:r>
-          </w:p>
-        </w:tc>
-      </w:tr>
-      <w:tr>
-        <w:trPr>
-          <w:trHeight w:val="400"/>
-        </w:trPr>
-        <w:tc>
-          <w:tcPr>
-            <w:tcW w:w="3120" w:type="dxa"/>
-            <w:tcBorders>
-              <w:top w:val="single" w:sz="4" w:space="0" w:color="999999"/>
-              <w:left w:val="single" w:sz="4" w:space="0" w:color="999999"/>
-              <w:bottom w:val="single" w:sz="4" w:space="0" w:color="999999"/>
-              <w:right w:val="single" w:sz="4" w:space="0" w:color="999999"/>
-            </w:tcBorders>
-          </w:tcPr>
-          <w:p>
-            <w:pPr>
-              <w:spacing w:after="0" w:line="259" w:lineRule="auto"/>
-              <w:ind w:left="0" w:right="0" w:firstLine="0"/>
-              <w:jc w:val="left"/>
-            </w:pPr>
-            <w:r>
-              <w:rPr>
-                <w:sz w:val="19"/>
-              </w:rPr>
-              <w:t>Input</w:t>
-            </w:r>
-          </w:p>
-        </w:tc>
-        <w:tc>
-          <w:tcPr>
-            <w:tcW w:w="3120" w:type="dxa"/>
-            <w:tcBorders>
-              <w:top w:val="single" w:sz="4" w:space="0" w:color="999999"/>
-              <w:left w:val="single" w:sz="4" w:space="0" w:color="999999"/>
-              <w:bottom w:val="single" w:sz="4" w:space="0" w:color="999999"/>
-              <w:right w:val="single" w:sz="4" w:space="0" w:color="999999"/>
-            </w:tcBorders>
-          </w:tcPr>
-          <w:p>
-            <w:pPr>
-              <w:spacing w:after="0" w:line="259" w:lineRule="auto"/>
-              <w:ind w:left="0" w:right="0" w:firstLine="0"/>
-              <w:jc w:val="left"/>
-            </w:pPr>
-            <w:r>
-              <w:rPr>
-                <w:sz w:val="19"/>
-              </w:rPr>
-              <w:t xml:space="preserve">Raw EEG (7 </w:t>
-            </w:r>
-            <w:proofErr w:type="spellStart"/>
-            <w:r>
-              <w:rPr>
-                <w:sz w:val="19"/>
-              </w:rPr>
-              <w:t>ch</w:t>
-            </w:r>
-            <w:proofErr w:type="spellEnd"/>
-            <w:r>
-              <w:rPr>
-                <w:sz w:val="19"/>
-              </w:rPr>
-              <w:t xml:space="preserve"> x 500 samples)</w:t>
-            </w:r>
-          </w:p>
-        </w:tc>
-        <w:tc>
-          <w:tcPr>
-            <w:tcW w:w="3120" w:type="dxa"/>
-            <w:tcBorders>
-              <w:top w:val="single" w:sz="4" w:space="0" w:color="999999"/>
-              <w:left w:val="single" w:sz="4" w:space="0" w:color="999999"/>
-              <w:bottom w:val="single" w:sz="4" w:space="0" w:color="999999"/>
-              <w:right w:val="single" w:sz="4" w:space="0" w:color="999999"/>
-            </w:tcBorders>
-          </w:tcPr>
-          <w:p>
-            <w:pPr>
-              <w:spacing w:after="0" w:line="259" w:lineRule="auto"/>
-              <w:ind w:left="0" w:right="0" w:firstLine="0"/>
-              <w:jc w:val="left"/>
-            </w:pPr>
-            <w:r>
-              <w:rPr>
-                <w:sz w:val="19"/>
-              </w:rPr>
-              <w:t>73 features x 20 timesteps</w:t>
-            </w:r>
-          </w:p>
-        </w:tc>
-      </w:tr>
-      <w:tr>
-        <w:trPr>
-          <w:trHeight w:val="400"/>
-        </w:trPr>
-        <w:tc>
-          <w:tcPr>
-            <w:tcW w:w="3120" w:type="dxa"/>
-            <w:tcBorders>
-              <w:top w:val="single" w:sz="4" w:space="0" w:color="999999"/>
-              <w:left w:val="single" w:sz="4" w:space="0" w:color="999999"/>
-              <w:bottom w:val="single" w:sz="4" w:space="0" w:color="999999"/>
-              <w:right w:val="single" w:sz="4" w:space="0" w:color="999999"/>
-            </w:tcBorders>
-            <w:shd w:val="clear" w:color="auto" w:fill="EAF2F8"/>
-          </w:tcPr>
-          <w:p>
-            <w:pPr>
-              <w:spacing w:after="0" w:line="259" w:lineRule="auto"/>
-              <w:ind w:left="0" w:right="0" w:firstLine="0"/>
-              <w:jc w:val="left"/>
-            </w:pPr>
-            <w:r>
-              <w:rPr>
-                <w:sz w:val="19"/>
-              </w:rPr>
-              <w:t>Architecture</w:t>
-            </w:r>
-          </w:p>
-        </w:tc>
-        <w:tc>
-          <w:tcPr>
-            <w:tcW w:w="3120" w:type="dxa"/>
-            <w:tcBorders>
-              <w:top w:val="single" w:sz="4" w:space="0" w:color="999999"/>
-              <w:left w:val="single" w:sz="4" w:space="0" w:color="999999"/>
-              <w:bottom w:val="single" w:sz="4" w:space="0" w:color="999999"/>
-              <w:right w:val="single" w:sz="4" w:space="0" w:color="999999"/>
-            </w:tcBorders>
-            <w:shd w:val="clear" w:color="auto" w:fill="EAF2F8"/>
-          </w:tcPr>
-          <w:p>
-            <w:pPr>
-              <w:spacing w:after="0" w:line="259" w:lineRule="auto"/>
-              <w:ind w:left="0" w:right="0" w:firstLine="0"/>
-              <w:jc w:val="left"/>
-            </w:pPr>
-            <w:r>
-              <w:rPr>
-                <w:sz w:val="19"/>
-              </w:rPr>
-              <w:t xml:space="preserve">Temporal + </w:t>
-            </w:r>
-            <w:proofErr w:type="spellStart"/>
-            <w:r>
-              <w:rPr>
-                <w:sz w:val="19"/>
-              </w:rPr>
-              <w:t>depthwise</w:t>
-            </w:r>
-            <w:proofErr w:type="spellEnd"/>
-            <w:r>
-              <w:rPr>
-                <w:sz w:val="19"/>
-              </w:rPr>
-              <w:t xml:space="preserve"> spatial conv</w:t>
-            </w:r>
-          </w:p>
-        </w:tc>
-        <w:tc>
-          <w:tcPr>
-            <w:tcW w:w="3120" w:type="dxa"/>
-            <w:tcBorders>
-              <w:top w:val="single" w:sz="4" w:space="0" w:color="999999"/>
-              <w:left w:val="single" w:sz="4" w:space="0" w:color="999999"/>
-              <w:bottom w:val="single" w:sz="4" w:space="0" w:color="999999"/>
-              <w:right w:val="single" w:sz="4" w:space="0" w:color="999999"/>
-            </w:tcBorders>
-            <w:shd w:val="clear" w:color="auto" w:fill="EAF2F8"/>
-          </w:tcPr>
-          <w:p>
-            <w:pPr>
-              <w:spacing w:after="0" w:line="259" w:lineRule="auto"/>
-              <w:ind w:left="0" w:right="0" w:firstLine="0"/>
-              <w:jc w:val="left"/>
-            </w:pPr>
-            <w:r>
-              <w:rPr>
-                <w:sz w:val="19"/>
-              </w:rPr>
-              <w:t>Dilated causal conv (d=1,2,4,8)</w:t>
-            </w:r>
-          </w:p>
-        </w:tc>
-      </w:tr>
-      <w:tr>
-        <w:trPr>
-          <w:trHeight w:val="400"/>
-        </w:trPr>
-        <w:tc>
-          <w:tcPr>
-            <w:tcW w:w="3120" w:type="dxa"/>
-            <w:tcBorders>
-              <w:top w:val="single" w:sz="4" w:space="0" w:color="999999"/>
-              <w:left w:val="single" w:sz="4" w:space="0" w:color="999999"/>
-              <w:bottom w:val="single" w:sz="4" w:space="0" w:color="999999"/>
-              <w:right w:val="single" w:sz="4" w:space="0" w:color="999999"/>
-            </w:tcBorders>
-          </w:tcPr>
-          <w:p>
-            <w:pPr>
-              <w:spacing w:after="0" w:line="259" w:lineRule="auto"/>
-              <w:ind w:left="0" w:right="0" w:firstLine="0"/>
-              <w:jc w:val="left"/>
-            </w:pPr>
-            <w:r>
-              <w:rPr>
-                <w:sz w:val="19"/>
-              </w:rPr>
-              <w:t>Output</w:t>
-            </w:r>
-          </w:p>
-        </w:tc>
-        <w:tc>
-          <w:tcPr>
-            <w:tcW w:w="3120" w:type="dxa"/>
-            <w:tcBorders>
-              <w:top w:val="single" w:sz="4" w:space="0" w:color="999999"/>
-              <w:left w:val="single" w:sz="4" w:space="0" w:color="999999"/>
-              <w:bottom w:val="single" w:sz="4" w:space="0" w:color="999999"/>
-              <w:right w:val="single" w:sz="4" w:space="0" w:color="999999"/>
-            </w:tcBorders>
-          </w:tcPr>
-          <w:p>
-            <w:pPr>
-              <w:spacing w:after="0" w:line="259" w:lineRule="auto"/>
-              <w:ind w:left="0" w:right="0" w:firstLine="0"/>
-              <w:jc w:val="left"/>
-            </w:pPr>
-            <w:r>
-              <w:rPr>
-                <w:sz w:val="19"/>
-              </w:rPr>
-              <w:t>Current PAC estimate</w:t>
-            </w:r>
-          </w:p>
-        </w:tc>
-        <w:tc>
-          <w:tcPr>
-            <w:tcW w:w="3120" w:type="dxa"/>
-            <w:tcBorders>
-              <w:top w:val="single" w:sz="4" w:space="0" w:color="999999"/>
-              <w:left w:val="single" w:sz="4" w:space="0" w:color="999999"/>
-              <w:bottom w:val="single" w:sz="4" w:space="0" w:color="999999"/>
-              <w:right w:val="single" w:sz="4" w:space="0" w:color="999999"/>
-            </w:tcBorders>
-          </w:tcPr>
-          <w:p>
-            <w:pPr>
-              <w:spacing w:after="0" w:line="259" w:lineRule="auto"/>
-              <w:ind w:left="0" w:right="0" w:firstLine="0"/>
-              <w:jc w:val="left"/>
-            </w:pPr>
-            <w:r>
-              <w:rPr>
-                <w:sz w:val="19"/>
-              </w:rPr>
-              <w:t>Future PAC (5s horizon)</w:t>
-            </w:r>
-          </w:p>
-        </w:tc>
-      </w:tr>
-      <w:tr>
-        <w:trPr>
-          <w:trHeight w:val="400"/>
-        </w:trPr>
-        <w:tc>
-          <w:tcPr>
-            <w:tcW w:w="3120" w:type="dxa"/>
-            <w:tcBorders>
-              <w:top w:val="single" w:sz="4" w:space="0" w:color="999999"/>
-              <w:left w:val="single" w:sz="4" w:space="0" w:color="999999"/>
-              <w:bottom w:val="single" w:sz="4" w:space="0" w:color="999999"/>
-              <w:right w:val="single" w:sz="4" w:space="0" w:color="999999"/>
-            </w:tcBorders>
-            <w:shd w:val="clear" w:color="auto" w:fill="EAF2F8"/>
-          </w:tcPr>
-          <w:p>
-            <w:pPr>
-              <w:spacing w:after="0" w:line="259" w:lineRule="auto"/>
-              <w:ind w:left="0" w:right="0" w:firstLine="0"/>
-              <w:jc w:val="left"/>
-            </w:pPr>
-            <w:r>
-              <w:rPr>
-                <w:sz w:val="19"/>
-              </w:rPr>
-              <w:t>Key feature</w:t>
-            </w:r>
-          </w:p>
-        </w:tc>
-        <w:tc>
-          <w:tcPr>
-            <w:tcW w:w="3120" w:type="dxa"/>
-            <w:tcBorders>
-              <w:top w:val="single" w:sz="4" w:space="0" w:color="999999"/>
-              <w:left w:val="single" w:sz="4" w:space="0" w:color="999999"/>
-              <w:bottom w:val="single" w:sz="4" w:space="0" w:color="999999"/>
-              <w:right w:val="single" w:sz="4" w:space="0" w:color="999999"/>
-            </w:tcBorders>
-            <w:shd w:val="clear" w:color="auto" w:fill="EAF2F8"/>
-          </w:tcPr>
-          <w:p>
-            <w:pPr>
-              <w:spacing w:after="0" w:line="259" w:lineRule="auto"/>
-              <w:ind w:left="0" w:right="0" w:firstLine="0"/>
-              <w:jc w:val="left"/>
-            </w:pPr>
-            <w:r>
-              <w:rPr>
-                <w:sz w:val="19"/>
-              </w:rPr>
-              <w:t>Real-time inference</w:t>
-            </w:r>
-          </w:p>
-        </w:tc>
-        <w:tc>
-          <w:tcPr>
-            <w:tcW w:w="3120" w:type="dxa"/>
-            <w:tcBorders>
-              <w:top w:val="single" w:sz="4" w:space="0" w:color="999999"/>
-              <w:left w:val="single" w:sz="4" w:space="0" w:color="999999"/>
-              <w:bottom w:val="single" w:sz="4" w:space="0" w:color="999999"/>
-              <w:right w:val="single" w:sz="4" w:space="0" w:color="999999"/>
-            </w:tcBorders>
-            <w:shd w:val="clear" w:color="auto" w:fill="EAF2F8"/>
-          </w:tcPr>
-          <w:p>
-            <w:pPr>
-              <w:spacing w:after="0" w:line="259" w:lineRule="auto"/>
-              <w:ind w:left="0" w:right="0" w:firstLine="0"/>
-              <w:jc w:val="left"/>
-            </w:pPr>
-            <w:r>
-              <w:rPr>
-                <w:sz w:val="19"/>
-              </w:rPr>
-              <w:t>31-step receptive field, causal</w:t>
-            </w:r>
-          </w:p>
-        </w:tc>
-      </w:tr>
-    </w:tbl>
-    <w:p>
-      <w:pPr>
-        <w:spacing w:after="812"/>
-        <w:ind w:left="-5" w:right="0"/>
-      </w:pPr>
-      <w:r>
-        <w:t>First training results were promising but showed a gap: validation R² = 0.411 versus test R² = 0.170. That gap reflects the cross-subject generalization challenge – PAC dynamics vary across patients. It also reinforced why personalized control matters.</w:t>
-      </w:r>
-    </w:p>
-    <w:p>
-      <w:pPr>
-        <w:spacing w:after="160" w:line="278" w:lineRule="auto"/>
-        <w:ind w:left="0" w:right="0" w:firstLine="0"/>
-        <w:jc w:val="left"/>
-        <w:rPr>
-          <w:b/>
-          <w:color w:val="000000" w:themeColor="text1"/>
-          <w:sz w:val="28"/>
-        </w:rPr>
-      </w:pPr>
-      <w:r>
-        <w:rPr>
-          <w:color w:val="000000" w:themeColor="text1"/>
-        </w:rPr>
-        <w:br w:type="page"/>
-      </w:r>
-    </w:p>
-    <w:p>
-      <w:pPr>
-        <w:pStyle w:val="Heading1"/>
-        <w:ind w:left="-5"/>
-        <w:rPr>
-          <w:color w:val="000000" w:themeColor="text1"/>
-          <w:u w:val="none"/>
-        </w:rPr>
-      </w:pPr>
-      <w:r>
-        <w:rPr>
-          <w:color w:val="000000" w:themeColor="text1"/>
-          <w:u w:val="none"/>
-        </w:rPr>
-        <w:lastRenderedPageBreak/>
-        <w:t>February 18, 2026 – Audit and Methodology Hardening</w:t>
-      </w:r>
-    </w:p>
-    <w:p>
-      <w:pPr>
-        <w:ind w:left="-5" w:right="0"/>
-      </w:pPr>
-      <w:r>
-        <w:t xml:space="preserve">Instead </w:t>
-      </w:r>
-      <w:r>
-        <w:t>of chasing a new result, I spent today making the project harder to fool myself with. The temporal model could easily be oversold. Smoothed targets make some metrics look much better than raw-target forecasting, and PAC-history features have obvious predictive power that needs to be described honestly.</w:t>
-      </w:r>
-    </w:p>
-    <w:p>
-      <w:pPr>
-        <w:ind w:left="-5" w:right="0"/>
-      </w:pPr>
-      <w:r>
-        <w:t>I documented assumptions, wrote out methodology choices, and checked the temporal pipeline for the failure modes that had already hurt the static phase: data leakage, split mistakes, and overly flattering interpretations. The data integrity checklist I ran through:</w:t>
-      </w:r>
-    </w:p>
-    <w:p>
-      <w:pPr>
-        <w:numPr>
-          <w:ilvl w:val="0"/>
-          <w:numId w:val="2"/>
-        </w:numPr>
-        <w:spacing w:after="73"/>
-        <w:ind w:right="0" w:hanging="132"/>
-      </w:pPr>
-      <w:r>
-        <w:rPr>
-          <w:b/>
-        </w:rPr>
-        <w:t>No subject leakage:</w:t>
-      </w:r>
-      <w:r>
-        <w:t xml:space="preserve"> Verified training, validation, and test subjects completely distinct.</w:t>
-      </w:r>
-    </w:p>
-    <w:p>
-      <w:pPr>
-        <w:numPr>
-          <w:ilvl w:val="0"/>
-          <w:numId w:val="2"/>
-        </w:numPr>
-        <w:spacing w:after="73"/>
-        <w:ind w:right="0" w:hanging="132"/>
-      </w:pPr>
-      <w:r>
-        <w:rPr>
-          <w:b/>
-        </w:rPr>
-        <w:t>Temporal causality:</w:t>
-      </w:r>
-      <w:r>
-        <w:t xml:space="preserve"> All feature timestamps strictly precede target timestamps.</w:t>
-      </w:r>
-    </w:p>
-    <w:p>
-      <w:pPr>
-        <w:numPr>
-          <w:ilvl w:val="0"/>
-          <w:numId w:val="2"/>
-        </w:numPr>
-        <w:spacing w:after="73"/>
-        <w:ind w:right="0" w:hanging="132"/>
-      </w:pPr>
-      <w:r>
-        <w:rPr>
-          <w:b/>
-        </w:rPr>
-        <w:t>Normalization leakage:</w:t>
-      </w:r>
-      <w:r>
-        <w:t xml:space="preserve"> Scalers fit only on training data, applied to all splits.</w:t>
-      </w:r>
-    </w:p>
-    <w:p>
-      <w:pPr>
-        <w:numPr>
-          <w:ilvl w:val="0"/>
-          <w:numId w:val="2"/>
-        </w:numPr>
-        <w:spacing w:after="72"/>
-        <w:ind w:right="0" w:hanging="132"/>
-      </w:pPr>
-      <w:r>
-        <w:rPr>
-          <w:b/>
-        </w:rPr>
-        <w:t>Feature-target correlation:</w:t>
-      </w:r>
-      <w:r>
-        <w:t xml:space="preserve"> No input features exceed r = 0.5 with target (after PAC leak removal from the SpecTempNet lesson).</w:t>
-      </w:r>
-    </w:p>
-    <w:p>
-      <w:pPr>
-        <w:numPr>
-          <w:ilvl w:val="0"/>
-          <w:numId w:val="2"/>
-        </w:numPr>
-        <w:spacing w:after="73"/>
-        <w:ind w:right="0" w:hanging="132"/>
-      </w:pPr>
-      <w:r>
-        <w:rPr>
-          <w:b/>
-        </w:rPr>
-        <w:t>Shuffle-label sanity:</w:t>
-      </w:r>
-      <w:r>
-        <w:t xml:space="preserve"> R² = -0.332 on permuted labels, confirming real signal and not artifacts.</w:t>
-      </w:r>
-    </w:p>
-    <w:p>
-      <w:pPr>
-        <w:spacing w:after="152"/>
-        <w:ind w:left="-5" w:right="0"/>
-      </w:pPr>
-      <w:r>
-        <w:t>I also analyzed the habituation patterns in the real EEG data, because this is the core motivation for adaptive control. Tracking PAC trajectories across all stimulation blocks for each of the 35 subjects:</w:t>
-      </w:r>
-    </w:p>
-    <w:p>
-      <w:pPr>
-        <w:shd w:val="clear" w:color="auto" w:fill="F0F0F0"/>
-        <w:spacing w:after="0" w:line="259" w:lineRule="auto"/>
-        <w:ind w:left="235" w:right="127"/>
-        <w:jc w:val="left"/>
-      </w:pPr>
-      <w:r>
-        <w:rPr>
-          <w:rFonts w:ascii="Courier New" w:eastAsia="Courier New" w:hAnsi="Courier New" w:cs="Courier New"/>
-          <w:sz w:val="18"/>
-        </w:rPr>
-        <w:t>First Block Mean PAC: 0.000996</w:t>
-      </w:r>
-    </w:p>
-    <w:p>
-      <w:pPr>
-        <w:shd w:val="clear" w:color="auto" w:fill="F0F0F0"/>
-        <w:spacing w:after="0" w:line="259" w:lineRule="auto"/>
-        <w:ind w:left="235" w:right="127"/>
-        <w:jc w:val="left"/>
-      </w:pPr>
-      <w:r>
-        <w:rPr>
-          <w:rFonts w:ascii="Courier New" w:eastAsia="Courier New" w:hAnsi="Courier New" w:cs="Courier New"/>
-          <w:sz w:val="18"/>
-        </w:rPr>
-        <w:t>Last Block Mean PAC: 0.001040</w:t>
-      </w:r>
-    </w:p>
-    <w:p>
-      <w:pPr>
-        <w:shd w:val="clear" w:color="auto" w:fill="F0F0F0"/>
-        <w:spacing w:after="240" w:line="259" w:lineRule="auto"/>
-        <w:ind w:left="235" w:right="127"/>
-        <w:jc w:val="left"/>
-      </w:pPr>
-      <w:r>
-        <w:rPr>
-          <w:rFonts w:ascii="Courier New" w:eastAsia="Courier New" w:hAnsi="Courier New" w:cs="Courier New"/>
-          <w:sz w:val="18"/>
-        </w:rPr>
-        <w:t>Population Change: +4.5% (not significant, p = 0.542)</w:t>
-      </w:r>
-    </w:p>
-    <w:p>
-      <w:pPr>
-        <w:ind w:left="-5" w:right="0"/>
-      </w:pPr>
-      <w:r>
-        <w:t>No population-level trend – but the individual variability told the real story:</w:t>
-      </w:r>
-    </w:p>
-    <w:tbl>
-      <w:tblPr>
-        <w:tblStyle w:val="TableGrid"/>
-        <w:tblW w:w="9360" w:type="dxa"/>
-        <w:tblInd w:w="-120" w:type="dxa"/>
-        <w:tblCellMar>
-          <w:top w:w="128" w:type="dxa"/>
-          <w:left w:w="0" w:type="dxa"/>
-          <w:bottom w:w="0" w:type="dxa"/>
           <w:right w:w="115" w:type="dxa"/>
         </w:tblCellMar>
         <w:tblLook w:val="04A0" w:firstRow="1" w:lastRow="0" w:firstColumn="1" w:lastColumn="0" w:noHBand="0" w:noVBand="1"/>
@@ -3816,19 +3515,11 @@
               <w:ind w:left="120" w:right="0" w:firstLine="0"/>
               <w:jc w:val="left"/>
             </w:pPr>
-            <w:proofErr w:type="spellStart"/>
-            <w:r>
-              <w:rPr>
-                <w:sz w:val="19"/>
-              </w:rPr>
-              <w:t>Habituators</w:t>
-            </w:r>
-            <w:proofErr w:type="spellEnd"/>
-            <w:r>
-              <w:rPr>
-                <w:sz w:val="19"/>
-              </w:rPr>
-              <w:t xml:space="preserve"> (PAC decline)</w:t>
+            <w:r>
+              <w:rPr>
+                <w:sz w:val="19"/>
+              </w:rPr>
+              <w:t>Habituators (PAC decline)</w:t>
             </w:r>
           </w:p>
         </w:tc>
@@ -4053,24 +3744,25 @@
         <w:ind w:left="-5" w:right="0"/>
       </w:pPr>
       <w:r>
-        <w:t xml:space="preserve">The cohort splits nearly equally between </w:t>
-      </w:r>
-      <w:proofErr w:type="spellStart"/>
-      <w:r>
-        <w:t>habituators</w:t>
-      </w:r>
-      <w:proofErr w:type="spellEnd"/>
-      <w:r>
-        <w:t xml:space="preserve"> and facilitators, which is why there is no population-level trend – the two groups cancel out. This validated the fundamental premise of the project: half of patients habituate while half do not, so fixed scheduling cannot serve both groups. One patient showed -66.8% decline (strong fatigue), another showed +149.1% increase (enhanced entrainment over time), and about 46.7% of individual stimulation blocks showed within-block PAC decline.</w:t>
-      </w:r>
-    </w:p>
-    <w:p>
-      <w:pPr>
-        <w:spacing w:after="812"/>
-        <w:ind w:left="-5" w:right="0"/>
-      </w:pPr>
-      <w:r>
-        <w:t>This data made it clear that adaptive control is not just an optimization; it addresses a real biological reality of individual variation.</w:t>
+        <w:t xml:space="preserve">The </w:t>
+      </w:r>
+      <w:r>
+        <w:t>subjects</w:t>
+      </w:r>
+      <w:r>
+        <w:t xml:space="preserve"> split nearly equally between habituators and facilitators, which is why there is no population</w:t>
+      </w:r>
+      <w:r>
+        <w:t xml:space="preserve"> </w:t>
+      </w:r>
+      <w:r>
+        <w:t>trend</w:t>
+      </w:r>
+      <w:r>
+        <w:t xml:space="preserve"> (it cancels). Half</w:t>
+      </w:r>
+      <w:r>
+        <w:t xml:space="preserve"> of patients habituate while half do not, so fixed scheduling cannot serve both groups. One patient showed -66.8% decline (strong fatigue), another showed +149.1% increase (enhanced entrainment over time), and about 46.7% of individual stimulation blocks showed within-block PAC decline.</w:t>
       </w:r>
     </w:p>
     <w:p>
@@ -4106,7 +3798,7 @@
           <w:u w:val="none"/>
         </w:rPr>
         <w:lastRenderedPageBreak/>
-        <w:t>February 19, 2026 – Horizon Sweep and Controller Integration</w:t>
+        <w:t>February 19, 2026</w:t>
       </w:r>
     </w:p>
     <w:p>
@@ -4114,7 +3806,19 @@
         <w:ind w:left="-5" w:right="0"/>
       </w:pPr>
       <w:r>
-        <w:t>Two major pieces today: the horizon sweep that proved where the TCN adds value, and the controller integration that turned predictions into decisions.</w:t>
+        <w:t>The</w:t>
+      </w:r>
+      <w:r>
+        <w:t xml:space="preserve"> horizon sweep that proved where the TCN adds value</w:t>
+      </w:r>
+      <w:r>
+        <w:t xml:space="preserve">; + I made the </w:t>
+      </w:r>
+      <w:r>
+        <w:t xml:space="preserve">controller integration that </w:t>
+      </w:r>
+      <w:r>
+        <w:t>acts based on the prediction</w:t>
       </w:r>
     </w:p>
     <w:p>
@@ -4133,8 +3837,6 @@
         <w:tblInd w:w="-120" w:type="dxa"/>
         <w:tblCellMar>
           <w:top w:w="128" w:type="dxa"/>
-          <w:left w:w="0" w:type="dxa"/>
-          <w:bottom w:w="0" w:type="dxa"/>
           <w:right w:w="115" w:type="dxa"/>
         </w:tblCellMar>
         <w:tblLook w:val="04A0" w:firstRow="1" w:lastRow="0" w:firstColumn="1" w:lastColumn="0" w:noHBand="0" w:noVBand="1"/>
@@ -5143,16 +4845,27 @@
       <w:pPr>
         <w:ind w:left="-5" w:right="0"/>
       </w:pPr>
-      <w:r>
-        <w:t>The pattern was clean. At 1-2 second horizons, PAC changes slowly enough that simple baselines win – persistence and Ridge both outperform the TCN. But at the 3-second crossover point, the TCN starts winning. At 5-10 seconds, both baselines collapse to negative R² (worse than predicting the mean) while the TCN maintains R² around 0.25. That +0.5 R² margin at the operationally relevant range is the TCN's value proposition.</w:t>
-      </w:r>
     </w:p>
     <w:p>
       <w:pPr>
         <w:ind w:left="-5" w:right="0"/>
       </w:pPr>
       <w:r>
-        <w:t>Why baselines fail: PAC autocorrelation decays to near-zero beyond ~3 seconds, so persistence becomes random. Why the TCN succeeds: multi-scale dilated convolutions capture patterns at timescales of 1, 2, 4, and 8 seconds, and nonlinear processing models complex temporal dynamics that linear methods miss.</w:t>
+        <w:t xml:space="preserve">At 1-2 second horizons, PAC changes slowly enough that simple baselines outperform the TCN. But at the 3-second crossover point, the TCN starts winning. At 5-10 seconds, both baselines collapse to negative R² (worse than predicting the mean) while the TCN maintains R² around 0.25. </w:t>
+      </w:r>
+      <w:proofErr w:type="gramStart"/>
+      <w:r>
+        <w:t>Thus</w:t>
+      </w:r>
+      <w:proofErr w:type="gramEnd"/>
+      <w:r>
+        <w:t xml:space="preserve"> the value prop of the TCN is the +0.5 </w:t>
+      </w:r>
+      <w:r>
+        <w:t>R² margin</w:t>
+      </w:r>
+      <w:r>
+        <w:t>.</w:t>
       </w:r>
     </w:p>
     <w:p>
@@ -5160,7 +4873,51 @@
         <w:ind w:left="-5" w:right="0"/>
       </w:pPr>
       <w:r>
-        <w:t>5-10 seconds is the clinically relevant range for proactive control. At 1-2 seconds there is not enough lead time for meaningful intervention. At 5-10 seconds there is sufficient time for decision processing and smooth stimulation transitions.</w:t>
+        <w:t>Baselines fail because</w:t>
+      </w:r>
+      <w:r>
+        <w:t xml:space="preserve"> PAC autocorrelation decays to near</w:t>
+      </w:r>
+      <w:r>
+        <w:t xml:space="preserve"> </w:t>
+      </w:r>
+      <w:r>
+        <w:t xml:space="preserve">zero beyond ~3 seconds, so persistence becomes random. </w:t>
+      </w:r>
+      <w:r>
+        <w:t>The</w:t>
+      </w:r>
+      <w:r>
+        <w:t xml:space="preserve"> TCN succeeds</w:t>
+      </w:r>
+      <w:r>
+        <w:t xml:space="preserve"> because</w:t>
+      </w:r>
+      <w:r>
+        <w:t xml:space="preserve"> multi-scale dilated convolutions capture </w:t>
+      </w:r>
+      <w:r>
+        <w:t xml:space="preserve">the </w:t>
+      </w:r>
+      <w:r>
+        <w:t xml:space="preserve">patterns at timescales of 1, 2, 4, and 8 seconds, and </w:t>
+      </w:r>
+      <w:r>
+        <w:t>it can model nonlinearity of the PAC.</w:t>
+      </w:r>
+    </w:p>
+    <w:p>
+      <w:pPr>
+        <w:ind w:left="-5" w:right="0"/>
+      </w:pPr>
+      <w:r>
+        <w:t xml:space="preserve">5-10 seconds is the relevant range for proactive control. At 1-2 seconds there is not enough lead time for meaningful intervention. At 5-10 seconds there is </w:t>
+      </w:r>
+      <w:r>
+        <w:t>enough</w:t>
+      </w:r>
+      <w:r>
+        <w:t xml:space="preserve"> time for decision processing and stimulation transitions.</w:t>
       </w:r>
     </w:p>
     <w:p>
@@ -5283,15 +5040,19 @@
         <w:ind w:left="-5" w:right="0"/>
       </w:pPr>
       <w:r>
-        <w:t xml:space="preserve">The </w:t>
-      </w:r>
-      <w:proofErr w:type="spellStart"/>
-      <w:r>
-        <w:t>PersonalizationModule</w:t>
-      </w:r>
-      <w:proofErr w:type="spellEnd"/>
-      <w:r>
-        <w:t xml:space="preserve"> maintains a 30-second rolling buffer to compute a per-patient z-score baseline. The controller logic combines reactive z-score decisions with TCN-predicted PAC trends: if the TCN predicts PAC will decline, stimulate proactively; if it predicts PAC will rise, let the brain maintain naturally; otherwise fall back to reactive control based on the current z-score. A 5-second hysteresis prevents rapid oscillation between states.</w:t>
+        <w:t>The PersonalizationModule maintains a 30-second rolling buffer to compute a per-patient z-score baseline. The controller logic combines reactive z-score decisions with TCN-predicted PAC trends</w:t>
+      </w:r>
+      <w:r>
+        <w:t>. I</w:t>
+      </w:r>
+      <w:r>
+        <w:t xml:space="preserve">f the TCN predicts PAC will decline, stimulate proactively; if it predicts PAC will rise, let the brain maintain naturally; otherwise fall back to reactive control based on the current z-score. A 5-second hysteresis prevents rapid </w:t>
+      </w:r>
+      <w:r>
+        <w:t xml:space="preserve">changes of </w:t>
+      </w:r>
+      <w:r>
+        <w:t>states.</w:t>
       </w:r>
     </w:p>
     <w:p>
@@ -5299,16 +5060,22 @@
         <w:spacing w:after="812"/>
         <w:ind w:left="-5" w:right="0"/>
       </w:pPr>
-      <w:r>
-        <w:t xml:space="preserve">End-to-end latency: under 5 </w:t>
-      </w:r>
-      <w:proofErr w:type="spellStart"/>
-      <w:r>
-        <w:t>ms</w:t>
-      </w:r>
-      <w:proofErr w:type="spellEnd"/>
-      <w:r>
-        <w:t xml:space="preserve"> (EEGNet + TCN + control logic). Memory: under 100 MB. Decision rate: 1 Hz. Light enough for embedded devices.</w:t>
+      <w:proofErr w:type="gramStart"/>
+      <w:r>
+        <w:t>LATENCY!</w:t>
+      </w:r>
+      <w:r>
+        <w:t>:</w:t>
+      </w:r>
+      <w:proofErr w:type="gramEnd"/>
+      <w:r>
+        <w:t xml:space="preserve"> under 5 ms (EEGNet + TCN + control logic). Memory: under 100 MB. Decision rate: 1 Hz. Light enough for embedded devices</w:t>
+      </w:r>
+      <w:r>
+        <w:t xml:space="preserve"> and wearable tech in the future</w:t>
+      </w:r>
+      <w:r>
+        <w:t>.</w:t>
       </w:r>
     </w:p>
     <w:p>
@@ -5344,7 +5111,7 @@
           <w:u w:val="none"/>
         </w:rPr>
         <w:lastRenderedPageBreak/>
-        <w:t>February 21, 2026 – Replay Framework and Robustness Setup</w:t>
+        <w:t>February 21, 2026</w:t>
       </w:r>
     </w:p>
     <w:p>
@@ -5352,7 +5119,22 @@
         <w:ind w:left="-5" w:right="0"/>
       </w:pPr>
       <w:r>
-        <w:t>Built the validation infrastructure needed to test the controller on real subject trajectories. This meant setting up the replay analysis framework (offline counterfactual analysis on recorded EEG), the rigorous validation scripts, and robustness-oriented tools.</w:t>
+        <w:t xml:space="preserve">Built the validation </w:t>
+      </w:r>
+      <w:r>
+        <w:t>protocol</w:t>
+      </w:r>
+      <w:r>
+        <w:t xml:space="preserve"> needed to test the controller on real subject trajectories. </w:t>
+      </w:r>
+      <w:r>
+        <w:t xml:space="preserve">Built replay </w:t>
+      </w:r>
+      <w:r>
+        <w:t xml:space="preserve">analysis framework (offline counterfactual analysis on recorded EEG), the validation scripts, and </w:t>
+      </w:r>
+      <w:r>
+        <w:t>other tools.</w:t>
       </w:r>
     </w:p>
     <w:p>
@@ -5360,7 +5142,10 @@
         <w:ind w:left="-5" w:right="0"/>
       </w:pPr>
       <w:r>
-        <w:t xml:space="preserve">I also ran fatigue sensitivity analysis through simulation. The question: does the adaptive advantage depend on specific mathematical assumptions about how neural fatigue works? I built an </w:t>
+        <w:t>Sub-q</w:t>
+      </w:r>
+      <w:r>
+        <w:t xml:space="preserve">uestion: does the adaptive advantage depend on specific mathematical assumptions about how neural fatigue works? I built an </w:t>
       </w:r>
       <w:proofErr w:type="spellStart"/>
       <w:r>
@@ -5376,10 +5161,13 @@
         <w:spacing w:after="0" w:line="259" w:lineRule="auto"/>
         <w:ind w:right="0"/>
         <w:jc w:val="left"/>
-      </w:pPr>
-      <w:r>
-        <w:rPr>
-          <w:b/>
+        <w:rPr>
+          <w:bCs/>
+        </w:rPr>
+      </w:pPr>
+      <w:r>
+        <w:rPr>
+          <w:bCs/>
         </w:rPr>
         <w:t>Fatigue severity results (n = 50 trials each, 600-second sessions):</w:t>
       </w:r>
@@ -5392,7 +5180,6 @@
         <w:tblCellMar>
           <w:top w:w="128" w:type="dxa"/>
           <w:left w:w="120" w:type="dxa"/>
-          <w:bottom w:w="0" w:type="dxa"/>
           <w:right w:w="115" w:type="dxa"/>
         </w:tblCellMar>
         <w:tblLook w:val="04A0" w:firstRow="1" w:lastRow="0" w:firstColumn="1" w:lastColumn="0" w:noHBand="0" w:noVBand="1"/>
@@ -6077,13 +5864,46 @@
         <w:t>*</w:t>
       </w:r>
       <w:r>
-        <w:t xml:space="preserve">p &lt; 0.001, Hedges' g = 1.7-2.4 (large to very large effects). The advantage grows as fatigue worsens – exactly when personalization matters most. Even with no fatigue at all, adaptive control wins by +9.5%, suggesting benefits beyond fatigue mitigation (targeting natural PAC fluctuations). </w:t>
-      </w:r>
-      <w:r>
-        <w:rPr>
-          <w:b/>
-        </w:rPr>
-        <w:t>Fatigue model robustness (4 different mathematical models, n = 50 trials each):</w:t>
+        <w:t xml:space="preserve">p &lt; 0.001, Hedges' g = 1.7-2.4 (large to very large effects). </w:t>
+      </w:r>
+      <w:r>
+        <w:t>As</w:t>
+      </w:r>
+      <w:r>
+        <w:t xml:space="preserve"> fatigue worsens </w:t>
+      </w:r>
+      <w:r>
+        <w:t>the advantage grows!</w:t>
+      </w:r>
+      <w:r>
+        <w:t xml:space="preserve"> </w:t>
+      </w:r>
+      <w:r>
+        <w:t>W</w:t>
+      </w:r>
+      <w:r>
+        <w:t xml:space="preserve">ith no fatigue at all, adaptive control </w:t>
+      </w:r>
+      <w:r>
+        <w:t xml:space="preserve">helps </w:t>
+      </w:r>
+      <w:r>
+        <w:t xml:space="preserve">by +9.5%, suggesting benefits beyond fatigue mitigation (targeting natural PAC fluctuations). </w:t>
+      </w:r>
+    </w:p>
+    <w:p>
+      <w:pPr>
+        <w:spacing w:after="0"/>
+        <w:ind w:left="-5" w:right="0"/>
+        <w:rPr>
+          <w:bCs/>
+        </w:rPr>
+      </w:pPr>
+      <w:r>
+        <w:rPr>
+          <w:bCs/>
+        </w:rPr>
+        <w:t>Fatigue model (4 different mathematical models, n = 50 trials each):</w:t>
       </w:r>
     </w:p>
     <w:tbl>
@@ -6093,8 +5913,6 @@
         <w:tblInd w:w="-120" w:type="dxa"/>
         <w:tblCellMar>
           <w:top w:w="128" w:type="dxa"/>
-          <w:left w:w="0" w:type="dxa"/>
-          <w:bottom w:w="0" w:type="dxa"/>
           <w:right w:w="115" w:type="dxa"/>
         </w:tblCellMar>
         <w:tblLook w:val="04A0" w:firstRow="1" w:lastRow="0" w:firstColumn="1" w:lastColumn="0" w:noHBand="0" w:noVBand="1"/>
@@ -6730,7 +6548,22 @@
         <w:ind w:left="-5" w:right="0"/>
       </w:pPr>
       <w:r>
-        <w:t>All models showed significant advantage. The saturation model (most biologically realistic, based on Michaelis-Menten receptor kinetics) showed the largest benefit at +19.0% with g = 3.66. The consistent advantage across four different mathematical formulations proved the results are not artifacts of any specific fatigue assumption.</w:t>
+        <w:t>All models showed significant advantage. The saturation model (</w:t>
+      </w:r>
+      <w:r>
+        <w:t xml:space="preserve">probably </w:t>
+      </w:r>
+      <w:r>
+        <w:t>most biologically realistic, based on Michaelis-Menten receptor kinetics) showed the largest benefit at +19.0% with g = 3.66. The</w:t>
+      </w:r>
+      <w:r>
+        <w:t xml:space="preserve"> </w:t>
+      </w:r>
+      <w:r>
+        <w:t xml:space="preserve">advantage across four different mathematical formulations </w:t>
+      </w:r>
+      <w:r>
+        <w:t>means for the real fatigue model my pipeline still provides benefit.</w:t>
       </w:r>
     </w:p>
     <w:p>
@@ -6739,7 +6572,13 @@
         <w:ind w:left="-5" w:right="0"/>
       </w:pPr>
       <w:r>
-        <w:t>I also ran threshold sensitivity analysis on the TCN controller, sweeping delta-z thresholds from 0.1 to 1.0:</w:t>
+        <w:t xml:space="preserve">I also ran threshold sensitivity analysis on the TCN controller, </w:t>
+      </w:r>
+      <w:r>
+        <w:t>testing</w:t>
+      </w:r>
+      <w:r>
+        <w:t xml:space="preserve"> delta-z thresholds from 0.1 to 1.0:</w:t>
       </w:r>
     </w:p>
     <w:tbl>
@@ -6750,7 +6589,6 @@
         <w:tblCellMar>
           <w:top w:w="128" w:type="dxa"/>
           <w:left w:w="120" w:type="dxa"/>
-          <w:bottom w:w="0" w:type="dxa"/>
           <w:right w:w="115" w:type="dxa"/>
         </w:tblCellMar>
         <w:tblLook w:val="04A0" w:firstRow="1" w:lastRow="0" w:firstColumn="1" w:lastColumn="0" w:noHBand="0" w:noVBand="1"/>
@@ -7104,7 +6942,6 @@
               <w:rPr>
                 <w:sz w:val="19"/>
               </w:rPr>
-              <w:lastRenderedPageBreak/>
               <w:t>0.3</w:t>
             </w:r>
           </w:p>
@@ -7207,6 +7044,7 @@
               <w:rPr>
                 <w:sz w:val="19"/>
               </w:rPr>
+              <w:lastRenderedPageBreak/>
               <w:t>0.4</w:t>
             </w:r>
           </w:p>
@@ -7559,7 +7397,7 @@
         <w:t>Gap note (February 22-25, 2026):</w:t>
       </w:r>
       <w:r>
-        <w:t xml:space="preserve"> Continued cleanup, figure generation, and validation plumbing. The final controller replay result was not locked until February 26.</w:t>
+        <w:t xml:space="preserve"> Continued cleanup, figure generation, and validation. The final controller replay result was not locked until February 26.</w:t>
       </w:r>
     </w:p>
     <w:p>
@@ -7602,7 +7440,7 @@
           <w:color w:val="000000" w:themeColor="text1"/>
           <w:u w:val="none"/>
         </w:rPr>
-        <w:t xml:space="preserve"> 26, 2026 – Real-Data TCN Validation Locked</w:t>
+        <w:t xml:space="preserve"> 26, 2026 </w:t>
       </w:r>
     </w:p>
     <w:p>
@@ -7610,10 +7448,19 @@
         <w:ind w:left="-5" w:right="0"/>
       </w:pPr>
       <w:r>
-        <w:t xml:space="preserve">This </w:t>
-      </w:r>
-      <w:r>
-        <w:t>was the day the final controller comparison on real patient EEG was locked. The validation methodology was offline counterfactual analysis: replay each subject's full EEG recording, have the controller make stimulate/rest decisions at each 2-second window, and compare those decisions against ground-truth PAC to compute alignment metrics. For this validation, I used ground-truth PAC labels as TCN input to isolate the TCN's predictive contribution from EEGNet estimation error.</w:t>
+        <w:t xml:space="preserve">This was the day the final controller comparison on real patient EEG was </w:t>
+      </w:r>
+      <w:r>
+        <w:t>finished</w:t>
+      </w:r>
+      <w:r>
+        <w:t xml:space="preserve">. </w:t>
+      </w:r>
+      <w:r>
+        <w:t>The method:</w:t>
+      </w:r>
+      <w:r>
+        <w:t xml:space="preserve"> replay each subject's full EEG recording, have the controller make stimulate/rest decisions at each 2-second window, and compare those decisions against ground-truth PAC to compute alignment metrics. For this validation, I used ground-truth PAC labels as TCN input to isolate the TCN's predictive contribution from EEGNet estimation error.</w:t>
       </w:r>
     </w:p>
     <w:p>
@@ -7621,7 +7468,7 @@
         <w:ind w:left="-5" w:right="0"/>
       </w:pPr>
       <w:r>
-        <w:t>Four controllers tested: Fixed Schedule (clinical standard: 40s ON / 20s OFF), Reactive Threshold (z-score on current PAC), TCN Predictive (z-score + 5-second lookahead), and Oracle (perfect future knowledge, theoretical upper bound).</w:t>
+        <w:t>Four controllers tested: Fixed Schedule (40s ON / 20s OFF), Reactive Threshold (z-score on current PAC), TCN Predictive (z-score + 5-second lookahead), and Oracle (theoretical upper bound).</w:t>
       </w:r>
     </w:p>
     <w:p>
@@ -7645,7 +7492,6 @@
         <w:tblCellMar>
           <w:top w:w="128" w:type="dxa"/>
           <w:left w:w="120" w:type="dxa"/>
-          <w:bottom w:w="0" w:type="dxa"/>
           <w:right w:w="115" w:type="dxa"/>
         </w:tblCellMar>
         <w:tblLook w:val="04A0" w:firstRow="1" w:lastRow="0" w:firstColumn="1" w:lastColumn="0" w:noHBand="0" w:noVBand="1"/>
@@ -8207,165 +8053,6 @@
       </w:tr>
       <w:tr>
         <w:trPr>
-          <w:trHeight w:val="640"/>
-        </w:trPr>
-        <w:tc>
-          <w:tcPr>
-            <w:tcW w:w="1872" w:type="dxa"/>
-            <w:tcBorders>
-              <w:top w:val="single" w:sz="4" w:space="0" w:color="999999"/>
-              <w:left w:val="single" w:sz="4" w:space="0" w:color="999999"/>
-              <w:bottom w:val="single" w:sz="4" w:space="0" w:color="999999"/>
-              <w:right w:val="single" w:sz="4" w:space="0" w:color="999999"/>
-            </w:tcBorders>
-            <w:shd w:val="clear" w:color="auto" w:fill="2C5F8A"/>
-            <w:vAlign w:val="center"/>
-          </w:tcPr>
-          <w:p>
-            <w:pPr>
-              <w:spacing w:after="0" w:line="259" w:lineRule="auto"/>
-              <w:ind w:left="0" w:right="5" w:firstLine="0"/>
-              <w:jc w:val="center"/>
-            </w:pPr>
-            <w:r>
-              <w:rPr>
-                <w:b/>
-                <w:color w:val="FFFFFF"/>
-                <w:sz w:val="19"/>
-              </w:rPr>
-              <w:t>Controller</w:t>
-            </w:r>
-          </w:p>
-        </w:tc>
-        <w:tc>
-          <w:tcPr>
-            <w:tcW w:w="1872" w:type="dxa"/>
-            <w:tcBorders>
-              <w:top w:val="single" w:sz="4" w:space="0" w:color="999999"/>
-              <w:left w:val="single" w:sz="4" w:space="0" w:color="999999"/>
-              <w:bottom w:val="single" w:sz="4" w:space="0" w:color="999999"/>
-              <w:right w:val="single" w:sz="4" w:space="0" w:color="999999"/>
-            </w:tcBorders>
-            <w:shd w:val="clear" w:color="auto" w:fill="2C5F8A"/>
-            <w:vAlign w:val="center"/>
-          </w:tcPr>
-          <w:p>
-            <w:pPr>
-              <w:spacing w:after="0" w:line="259" w:lineRule="auto"/>
-              <w:ind w:left="0" w:right="5" w:firstLine="0"/>
-              <w:jc w:val="center"/>
-            </w:pPr>
-            <w:r>
-              <w:rPr>
-                <w:b/>
-                <w:color w:val="FFFFFF"/>
-                <w:sz w:val="19"/>
-              </w:rPr>
-              <w:t>Alignment</w:t>
-            </w:r>
-          </w:p>
-        </w:tc>
-        <w:tc>
-          <w:tcPr>
-            <w:tcW w:w="1872" w:type="dxa"/>
-            <w:tcBorders>
-              <w:top w:val="single" w:sz="4" w:space="0" w:color="999999"/>
-              <w:left w:val="single" w:sz="4" w:space="0" w:color="999999"/>
-              <w:bottom w:val="single" w:sz="4" w:space="0" w:color="999999"/>
-              <w:right w:val="single" w:sz="4" w:space="0" w:color="999999"/>
-            </w:tcBorders>
-            <w:shd w:val="clear" w:color="auto" w:fill="2C5F8A"/>
-          </w:tcPr>
-          <w:p>
-            <w:pPr>
-              <w:spacing w:after="2" w:line="259" w:lineRule="auto"/>
-              <w:ind w:left="0" w:right="5" w:firstLine="0"/>
-              <w:jc w:val="center"/>
-            </w:pPr>
-            <w:r>
-              <w:rPr>
-                <w:b/>
-                <w:color w:val="FFFFFF"/>
-                <w:sz w:val="19"/>
-              </w:rPr>
-              <w:t>Low-PAC</w:t>
-            </w:r>
-          </w:p>
-          <w:p>
-            <w:pPr>
-              <w:spacing w:after="0" w:line="259" w:lineRule="auto"/>
-              <w:ind w:left="0" w:right="5" w:firstLine="0"/>
-              <w:jc w:val="center"/>
-            </w:pPr>
-            <w:r>
-              <w:rPr>
-                <w:b/>
-                <w:color w:val="FFFFFF"/>
-                <w:sz w:val="19"/>
-              </w:rPr>
-              <w:t>Targeting</w:t>
-            </w:r>
-          </w:p>
-        </w:tc>
-        <w:tc>
-          <w:tcPr>
-            <w:tcW w:w="1872" w:type="dxa"/>
-            <w:tcBorders>
-              <w:top w:val="single" w:sz="4" w:space="0" w:color="999999"/>
-              <w:left w:val="single" w:sz="4" w:space="0" w:color="999999"/>
-              <w:bottom w:val="single" w:sz="4" w:space="0" w:color="999999"/>
-              <w:right w:val="single" w:sz="4" w:space="0" w:color="999999"/>
-            </w:tcBorders>
-            <w:shd w:val="clear" w:color="auto" w:fill="2C5F8A"/>
-            <w:vAlign w:val="center"/>
-          </w:tcPr>
-          <w:p>
-            <w:pPr>
-              <w:spacing w:after="0" w:line="259" w:lineRule="auto"/>
-              <w:ind w:left="59" w:right="0" w:firstLine="0"/>
-              <w:jc w:val="left"/>
-            </w:pPr>
-            <w:r>
-              <w:rPr>
-                <w:b/>
-                <w:color w:val="FFFFFF"/>
-                <w:sz w:val="19"/>
-              </w:rPr>
-              <w:t>PAC Gap (x10^-6)</w:t>
-            </w:r>
-          </w:p>
-        </w:tc>
-        <w:tc>
-          <w:tcPr>
-            <w:tcW w:w="1872" w:type="dxa"/>
-            <w:tcBorders>
-              <w:top w:val="single" w:sz="4" w:space="0" w:color="999999"/>
-              <w:left w:val="single" w:sz="4" w:space="0" w:color="999999"/>
-              <w:bottom w:val="single" w:sz="4" w:space="0" w:color="999999"/>
-              <w:right w:val="single" w:sz="4" w:space="0" w:color="999999"/>
-            </w:tcBorders>
-            <w:shd w:val="clear" w:color="auto" w:fill="2C5F8A"/>
-            <w:vAlign w:val="center"/>
-          </w:tcPr>
-          <w:p>
-            <w:pPr>
-              <w:spacing w:after="0" w:line="259" w:lineRule="auto"/>
-              <w:ind w:left="0" w:right="5" w:firstLine="0"/>
-              <w:jc w:val="center"/>
-            </w:pPr>
-            <w:r>
-              <w:rPr>
-                <w:b/>
-                <w:color w:val="FFFFFF"/>
-                <w:sz w:val="19"/>
-              </w:rPr>
-              <w:t>Stim %</w:t>
-            </w:r>
-          </w:p>
-        </w:tc>
-      </w:tr>
-      <w:tr>
-        <w:trPr>
           <w:trHeight w:val="400"/>
         </w:trPr>
         <w:tc>
@@ -8499,8 +8186,13 @@
       <w:pPr>
         <w:ind w:left="-5" w:right="0"/>
       </w:pPr>
-      <w:r>
-        <w:t>Metric definitions: Alignment = (Low-PAC Stim Rate + High-PAC Rest Rate) / 2, measuring balanced accuracy of therapeutic targeting. Low-PAC Targeting = percentage of below-median PAC windows where the controller stimulates ("did we treat when the brain needed it?"). PAC Gap = mean PAC during rest minus mean PAC during stim (positive means the controller correctly targets low-PAC periods).</w:t>
+    </w:p>
+    <w:p>
+      <w:pPr>
+        <w:ind w:left="-5" w:right="0"/>
+      </w:pPr>
+      <w:r>
+        <w:t>Alignment = (Low-PAC Stim Rate + High-PAC Rest Rate) / 2, balanced accuracy of therapeutic targeting. Low-PAC Targeting = percentage of below-median PAC windows where the controller stimulates ("did we treat when the brain needed it?"). PAC Gap = mean PAC during rest minus mean PAC during stim (positive means the controller correctly targets low-PAC periods).</w:t>
       </w:r>
     </w:p>
     <w:p>
@@ -8508,12 +8200,15 @@
         <w:spacing w:after="115" w:line="259" w:lineRule="auto"/>
         <w:ind w:right="0"/>
         <w:jc w:val="left"/>
-      </w:pPr>
-      <w:r>
-        <w:rPr>
-          <w:b/>
-        </w:rPr>
-        <w:t>Statistical significance (TCN vs Reactive):</w:t>
+        <w:rPr>
+          <w:bCs/>
+        </w:rPr>
+      </w:pPr>
+      <w:r>
+        <w:rPr>
+          <w:bCs/>
+        </w:rPr>
+        <w:t>TCN vs Reactive:</w:t>
       </w:r>
     </w:p>
     <w:p>
@@ -8565,24 +8260,55 @@
         <w:ind w:right="0" w:firstLine="360"/>
       </w:pPr>
       <w:r>
-        <w:t xml:space="preserve">All Wilcoxon signed-rank tests, bootstrap 95% confidence </w:t>
+        <w:t>All Wilcoxon signed-rank tests, bootstrap 95% confidence intervals</w:t>
+      </w:r>
+    </w:p>
+    <w:p>
+      <w:pPr>
+        <w:spacing w:after="40" w:line="330" w:lineRule="auto"/>
+        <w:ind w:right="0"/>
+      </w:pPr>
+      <w:r>
+        <w:rPr>
+          <w:b/>
+        </w:rPr>
+        <w:t>Key findings:</w:t>
+      </w:r>
+    </w:p>
+    <w:p>
+      <w:pPr>
+        <w:ind w:left="-5" w:right="0"/>
+      </w:pPr>
+      <w:r>
+        <w:t>The fixed schedule went in the wrong direction (-6.6), meaning it stimulated more during high-PAC than low-PAC periods. Timing was uncorrelated with brain state.</w:t>
+      </w:r>
+    </w:p>
+    <w:p>
+      <w:pPr>
+        <w:ind w:left="-5" w:right="0"/>
+      </w:pPr>
+      <w:r>
+        <w:t xml:space="preserve">The TCN achieved 92% of oracle performance: PAC gap 30.5 versus 33.3 theoretical maximum (30.5/33.3 = 92%). It targeted 82.6% of low-PAC windows versus </w:t>
       </w:r>
       <w:proofErr w:type="spellStart"/>
       <w:r>
-        <w:t>intervals</w:t>
-      </w:r>
-      <w:r>
-        <w:rPr>
-          <w:b/>
-        </w:rPr>
-        <w:t>Key</w:t>
+        <w:t>Reactive's</w:t>
       </w:r>
       <w:proofErr w:type="spellEnd"/>
       <w:r>
-        <w:rPr>
-          <w:b/>
-        </w:rPr>
-        <w:t xml:space="preserve"> findings:</w:t>
+        <w:t xml:space="preserve"> 51.7%</w:t>
+      </w:r>
+      <w:r>
+        <w:t>,</w:t>
+      </w:r>
+      <w:r>
+        <w:t xml:space="preserve"> a 60% improvement in </w:t>
+      </w:r>
+      <w:r>
+        <w:t>timing</w:t>
+      </w:r>
+      <w:r>
+        <w:t>. And it used less stimulation than Fixed Schedule (59.7% vs 66.6%), meaning better outcomes with less total stimulation.</w:t>
       </w:r>
     </w:p>
     <w:p>
@@ -8590,7 +8316,13 @@
         <w:ind w:left="-5" w:right="0"/>
       </w:pPr>
       <w:r>
-        <w:t>The fixed schedule was not merely weaker – its PAC gap went in the wrong direction (-6.6), meaning it stimulated more during high-PAC than low-PAC periods. Timing was uncorrelated with brain state.</w:t>
+        <w:t>The reactive controller missed 48% of low-PAC windows that needed treatment. Its conservatism (36.7% total stim) mean</w:t>
+      </w:r>
+      <w:r>
+        <w:t>s</w:t>
+      </w:r>
+      <w:r>
+        <w:t xml:space="preserve"> high specificity but terrible sensitivity.</w:t>
       </w:r>
     </w:p>
     <w:p>
@@ -8598,32 +8330,7 @@
         <w:ind w:left="-5" w:right="0"/>
       </w:pPr>
       <w:r>
-        <w:t xml:space="preserve">The TCN achieved 92% of oracle performance: PAC gap 30.5 versus 33.3 theoretical maximum (30.5/33.3 = 92%). It targeted 82.6% of low-PAC windows versus </w:t>
-      </w:r>
-      <w:proofErr w:type="spellStart"/>
-      <w:r>
-        <w:t>Reactive's</w:t>
-      </w:r>
-      <w:proofErr w:type="spellEnd"/>
-      <w:r>
-        <w:t xml:space="preserve"> 51.7% – a 60% improvement in therapeutic precision. And it used less stimulation than Fixed Schedule (59.7% vs 66.6%), meaning better outcomes with less total stimulation.</w:t>
-      </w:r>
-    </w:p>
-    <w:p>
-      <w:pPr>
-        <w:ind w:left="-5" w:right="0"/>
-      </w:pPr>
-      <w:r>
-        <w:t>The reactive controller missed 48% of low-PAC windows that needed treatment. Its conservatism (36.7% total stim) meant high specificity but terrible sensitivity.</w:t>
-      </w:r>
-    </w:p>
-    <w:p>
-      <w:pPr>
-        <w:ind w:left="-5" w:right="0"/>
-      </w:pPr>
-      <w:r>
-        <w:lastRenderedPageBreak/>
-        <w:t>All 35 of 35 subjects showed higher clinical utility with TCN versus Reactive (binomial p &lt; 0.001). This held for the 6 held-out test subjects never seen during training, demonstrating robust cross-subject generalization.</w:t>
+        <w:t>All 35 of 35 subjects showed higher clinical utility with TCN versus Reactive (binomial p &lt; 0.001). This held for the 6 held-out test subjects never seen during training, demonstrating cross-subject generalization.</w:t>
       </w:r>
     </w:p>
     <w:p>
@@ -8636,6 +8343,7 @@
         <w:rPr>
           <w:noProof/>
         </w:rPr>
+        <w:lastRenderedPageBreak/>
         <w:drawing>
           <wp:inline distT="0" distB="0" distL="0" distR="0" wp14:anchorId="55514745" wp14:editId="2A27FD08">
             <wp:extent cx="5943600" cy="3212019"/>
@@ -8852,7 +8560,7 @@
           <w:u w:val="none"/>
         </w:rPr>
         <w:lastRenderedPageBreak/>
-        <w:t>March 1, 2026 – Documentation Freeze and Submission</w:t>
+        <w:t xml:space="preserve">March 1, 2026 </w:t>
       </w:r>
     </w:p>
     <w:p>
@@ -8860,7 +8568,7 @@
         <w:ind w:left="-5" w:right="0"/>
       </w:pPr>
       <w:r>
-        <w:t>The science was finished, so today was about packaging. I compiled all results into the poster, abstract, and this notebook for the Synopsys Science Fair submission. The most important discipline was not adding anything new – just consolidating what was validated and making it presentable for judges.</w:t>
+        <w:t xml:space="preserve">I compiled all results into the poster, abstract, and this notebook for the Synopsys Science Fair submission. </w:t>
       </w:r>
     </w:p>
     <w:p>
@@ -8907,15 +8615,25 @@
         <w:ind w:right="0"/>
       </w:pPr>
       <w:r>
-        <w:t xml:space="preserve">At 5-10 second horizons, the TCN maintains R² around 0.25 while all baselines collapse </w:t>
-      </w:r>
-      <w:proofErr w:type="spellStart"/>
-      <w:r>
-        <w:t>belowzero</w:t>
-      </w:r>
-      <w:proofErr w:type="spellEnd"/>
-      <w:r>
-        <w:t xml:space="preserve"> – a +0.5 R² margin at the operationally relevant range for proactive control.</w:t>
+        <w:t>At 5-10 second horizons, the TCN maintains R² around 0.25 while all baselines collapse below</w:t>
+      </w:r>
+      <w:r>
+        <w:t xml:space="preserve"> </w:t>
+      </w:r>
+      <w:r>
+        <w:t>zero</w:t>
+      </w:r>
+      <w:r>
+        <w:t xml:space="preserve"> (</w:t>
+      </w:r>
+      <w:r>
+        <w:t>+0.5 R² margin at the relevant range for proactive control</w:t>
+      </w:r>
+      <w:r>
+        <w:t>)</w:t>
+      </w:r>
+      <w:r>
+        <w:t>.</w:t>
       </w:r>
     </w:p>
     <w:p>
@@ -8928,15 +8646,25 @@
         <w:ind w:right="0"/>
       </w:pPr>
       <w:r>
-        <w:t xml:space="preserve">On real patient EEG: 72.1% alignment versus 64.5% reactive (p &lt; 0.001), targeting 82.6% </w:t>
-      </w:r>
-      <w:proofErr w:type="spellStart"/>
-      <w:r>
-        <w:t>oflow</w:t>
-      </w:r>
-      <w:proofErr w:type="spellEnd"/>
-      <w:r>
-        <w:t>-PAC windows versus 51.7% – a 60% improvement in therapeutic targeting.</w:t>
+        <w:t>On real patient EEG: 72.1% alignment versus 64.5% reactive (p &lt; 0.001), targeting 82.6% of</w:t>
+      </w:r>
+      <w:r>
+        <w:t xml:space="preserve"> </w:t>
+      </w:r>
+      <w:r>
+        <w:t xml:space="preserve">low-PAC windows versus 51.7% </w:t>
+      </w:r>
+      <w:r>
+        <w:t>(</w:t>
+      </w:r>
+      <w:r>
+        <w:t>60% improvement in therapeutic targeting</w:t>
+      </w:r>
+      <w:r>
+        <w:t>)</w:t>
+      </w:r>
+      <w:r>
+        <w:t>.</w:t>
       </w:r>
     </w:p>
     <w:p>
@@ -8949,15 +8677,13 @@
         <w:ind w:right="0"/>
       </w:pPr>
       <w:r>
-        <w:t xml:space="preserve">All 35 patients benefited, including 6 held-out test subjects. Generalizes across individual </w:t>
-      </w:r>
-      <w:proofErr w:type="spellStart"/>
-      <w:r>
-        <w:t>EEGpatterns</w:t>
-      </w:r>
-      <w:proofErr w:type="spellEnd"/>
-      <w:r>
-        <w:t>.</w:t>
+        <w:t>All 35 patients benefited, including 6 held-out test subjects. Generalizes across individual EEG</w:t>
+      </w:r>
+      <w:r>
+        <w:t xml:space="preserve"> </w:t>
+      </w:r>
+      <w:r>
+        <w:t>patterns.</w:t>
       </w:r>
     </w:p>
     <w:p>
@@ -8969,15 +8695,13 @@
         <w:ind w:right="0"/>
       </w:pPr>
       <w:r>
-        <w:t xml:space="preserve">Adaptive advantage increases with fatigue (+9.0% to +11.2%) and holds across four </w:t>
-      </w:r>
-      <w:proofErr w:type="spellStart"/>
-      <w:r>
-        <w:t>fatiguemodel</w:t>
-      </w:r>
-      <w:proofErr w:type="spellEnd"/>
-      <w:r>
-        <w:t xml:space="preserve"> assumptions (Hedges' g = 1.21-3.66, all p &lt; 0.001).</w:t>
+        <w:t>Adaptive advantage increases with fatigue (+9.0% to +11.2%) and holds across four fatigue</w:t>
+      </w:r>
+      <w:r>
+        <w:t xml:space="preserve"> </w:t>
+      </w:r>
+      <w:r>
+        <w:t>model assumptions (Hedges' g = 1.21-3.66, all p &lt; 0.001).</w:t>
       </w:r>
     </w:p>
     <w:p>
@@ -8990,15 +8714,13 @@
         <w:ind w:right="0"/>
       </w:pPr>
       <w:r>
-        <w:t xml:space="preserve">Half of patients habituate while half do not, validating the need for personalized rather than </w:t>
-      </w:r>
-      <w:proofErr w:type="spellStart"/>
-      <w:r>
-        <w:t>fixedscheduling</w:t>
-      </w:r>
-      <w:proofErr w:type="spellEnd"/>
-      <w:r>
-        <w:t>.</w:t>
+        <w:t>Half of patients habituate while half do not, validating the need for personalized rather than fixed</w:t>
+      </w:r>
+      <w:r>
+        <w:t xml:space="preserve"> </w:t>
+      </w:r>
+      <w:r>
+        <w:t>scheduling.</w:t>
       </w:r>
     </w:p>
     <w:p>
@@ -9007,12 +8729,12 @@
       </w:pPr>
       <w:r>
         <w:rPr>
-          <w:b/>
+          <w:bCs/>
         </w:rPr>
         <w:t>Limitation:</w:t>
       </w:r>
       <w:r>
-        <w:t xml:space="preserve"> Real-data validation uses offline replay on recorded EEG, not live closed-loop streaming. The system makes decisions on real brain data but cannot observe the brain's response to those decisions.</w:t>
+        <w:t xml:space="preserve"> The system makes decisions on real brain data but cannot observe the brain's response to those decisions.</w:t>
       </w:r>
     </w:p>
     <w:p>
@@ -9038,15 +8760,19 @@
         <w:ind w:right="0" w:hanging="132"/>
       </w:pPr>
       <w:r>
-        <w:t xml:space="preserve">Deploy with live EEG streaming for real-time crossover validation (adaptive vs fixed within </w:t>
-      </w:r>
-      <w:proofErr w:type="spellStart"/>
-      <w:r>
-        <w:t>samesession</w:t>
-      </w:r>
-      <w:proofErr w:type="spellEnd"/>
-      <w:r>
-        <w:t>)</w:t>
+        <w:t>Deploy with live EEG streaming for real</w:t>
+      </w:r>
+      <w:r>
+        <w:t xml:space="preserve"> </w:t>
+      </w:r>
+      <w:r>
+        <w:t>time crossover validation (adaptive vs fixed within same</w:t>
+      </w:r>
+      <w:r>
+        <w:t xml:space="preserve"> </w:t>
+      </w:r>
+      <w:r>
+        <w:t>session)</w:t>
       </w:r>
     </w:p>
     <w:p>
@@ -9080,7 +8806,19 @@
         <w:ind w:right="0" w:hanging="132"/>
       </w:pPr>
       <w:r>
-        <w:t>Replace the heuristic controller with reinforcement learning for long-horizon optimization</w:t>
+        <w:t xml:space="preserve">Replace the heuristic controller with </w:t>
+      </w:r>
+      <w:r>
+        <w:t>RL</w:t>
+      </w:r>
+      <w:r>
+        <w:t xml:space="preserve"> for long</w:t>
+      </w:r>
+      <w:r>
+        <w:t xml:space="preserve"> </w:t>
+      </w:r>
+      <w:r>
+        <w:t>horizon optimization</w:t>
       </w:r>
     </w:p>
     <w:p>
@@ -9143,12 +8881,15 @@
       </w:pPr>
       <w:r>
         <w:rPr>
-          <w:b/>
+          <w:bCs/>
         </w:rPr>
         <w:t>Compute:</w:t>
       </w:r>
       <w:r>
-        <w:t xml:space="preserve"> MacBook Pro (Apple M1 Pro, 16 GB RAM). All computation on local hardware, no cloud GPU required.</w:t>
+        <w:t xml:space="preserve"> MacBook Pro (Apple M1 Pro, 16 GB RAM). All computation on local hardware</w:t>
+      </w:r>
+      <w:r>
+        <w:t>.</w:t>
       </w:r>
     </w:p>
     <w:p>
@@ -9167,7 +8908,7 @@
         <w:t>Software:</w:t>
       </w:r>
       <w:r>
-        <w:t xml:space="preserve"> Python 3.13, PyTorch, NumPy, SciPy, scikit-learn, h5py, MNE-Python. Git version control.</w:t>
+        <w:t xml:space="preserve"> Python 3.13, PyTorch, NumPy, SciPy, scikit-learn, h5py, MNE-Python. Git</w:t>
       </w:r>
     </w:p>
     <w:p>
@@ -9315,29 +9056,6 @@
       </w:r>
       <w:r>
         <w:t>, 73(1), 16-43.</w:t>
-      </w:r>
-    </w:p>
-    <w:p>
-      <w:pPr>
-        <w:ind w:left="-5" w:right="0"/>
-      </w:pPr>
-      <w:r>
-        <w:rPr>
-          <w:b/>
-        </w:rPr>
-        <w:t>Submitted to Synopsys Science and Engineering Fair 2026</w:t>
-      </w:r>
-      <w:r>
-        <w:t xml:space="preserve"> </w:t>
-      </w:r>
-      <w:r>
-        <w:rPr>
-          <w:b/>
-        </w:rPr>
-        <w:t>Category:</w:t>
-      </w:r>
-      <w:r>
-        <w:t xml:space="preserve"> Biological Science and Engineering, Computational Biology and Bioinformatics</w:t>
       </w:r>
     </w:p>
     <w:sectPr>

</xml_diff>